<commit_message>
fix: update ssl pinning
</commit_message>
<xml_diff>
--- a/docs/TDE_SQL_Server.docx
+++ b/docs/TDE_SQL_Server.docx
@@ -3272,16 +3272,36 @@
     </w:p>
     <w:p>
       <w:pPr>
+        <w:rPr>
+          <w:rFonts w:cstheme="majorBidi"/>
+          <w:b/>
+          <w:bCs/>
+          <w:color w:val="0B3660"/>
+          <w:sz w:val="36"/>
+          <w:szCs w:val="28"/>
+        </w:rPr>
+      </w:pPr>
+      <w:bookmarkStart w:id="8" w:name="_Toc239080649"/>
+      <w:r>
+        <w:rPr>
+          <w:color w:val="0B3660"/>
+          <w:sz w:val="36"/>
+        </w:rPr>
+        <w:br w:type="page"/>
+      </w:r>
+    </w:p>
+    <w:p>
+      <w:pPr>
         <w:pStyle w:val="Heading1"/>
         <w:spacing w:before="320" w:after="120"/>
       </w:pPr>
-      <w:bookmarkStart w:id="8" w:name="_Toc239080649"/>
       <w:r>
         <w:rPr>
           <w:rFonts w:ascii="Calibri" w:eastAsia="Calibri" w:hAnsi="Calibri"/>
           <w:color w:val="0B3660"/>
           <w:sz w:val="36"/>
         </w:rPr>
+        <w:lastRenderedPageBreak/>
         <w:t>3. Mengaktifkan TDE</w:t>
       </w:r>
       <w:bookmarkEnd w:id="8"/>
@@ -3297,10 +3317,19 @@
     <w:p>
       <w:pPr>
         <w:pStyle w:val="ListNumber"/>
+        <w:numPr>
+          <w:ilvl w:val="0"/>
+          <w:numId w:val="10"/>
+        </w:numPr>
         <w:spacing w:after="60" w:line="269" w:lineRule="auto"/>
       </w:pPr>
-      <w:r>
-        <w:t>Buat master key di database master.</w:t>
+      <w:proofErr w:type="spellStart"/>
+      <w:r>
+        <w:t>Buat</w:t>
+      </w:r>
+      <w:proofErr w:type="spellEnd"/>
+      <w:r>
+        <w:t xml:space="preserve"> master key di database master.</w:t>
       </w:r>
     </w:p>
     <w:p>
@@ -3342,7 +3371,6 @@
           <w:color w:val="0078D4"/>
           <w:sz w:val="28"/>
         </w:rPr>
-        <w:lastRenderedPageBreak/>
         <w:t>3.1 Contoh resmi Microsoft (AdventureWorks)</w:t>
       </w:r>
       <w:bookmarkEnd w:id="9"/>
@@ -3725,11 +3753,30 @@
       </w:r>
     </w:p>
     <w:p>
+      <w:r>
+        <w:br w:type="page"/>
+      </w:r>
+    </w:p>
+    <w:p>
       <w:pPr>
         <w:spacing w:after="160"/>
       </w:pPr>
-      <w:r>
-        <w:t>Jalankan di SSMS atau sqlcmd. Ganti password di bawah sebelum dipakai di luar lab. Perintah CREATE MASTER KEY gagal jika DMK di master sudah ada — itu normal; lanjutkan ke CREATE CERTIFICATE.</w:t>
+      <w:proofErr w:type="spellStart"/>
+      <w:r>
+        <w:lastRenderedPageBreak/>
+        <w:t>Jalankan</w:t>
+      </w:r>
+      <w:proofErr w:type="spellEnd"/>
+      <w:r>
+        <w:t xml:space="preserve"> di SSMS </w:t>
+      </w:r>
+      <w:proofErr w:type="spellStart"/>
+      <w:r>
+        <w:t>atau</w:t>
+      </w:r>
+      <w:proofErr w:type="spellEnd"/>
+      <w:r>
+        <w:t xml:space="preserve"> sqlcmd. Ganti password di bawah sebelum dipakai di luar lab. Perintah CREATE MASTER KEY gagal jika DMK di master sudah ada — itu normal; lanjutkan ke CREATE CERTIFICATE.</w:t>
       </w:r>
     </w:p>
     <w:p>
@@ -4014,7 +4061,6 @@
           <w:color w:val="1B1B1B"/>
           <w:sz w:val="18"/>
         </w:rPr>
-        <w:lastRenderedPageBreak/>
         <w:t>GO</w:t>
       </w:r>
     </w:p>
@@ -4393,9 +4439,9 @@
       </w:r>
     </w:p>
     <w:p>
-      <w:pPr>
-        <w:spacing w:after="160"/>
-      </w:pPr>
+      <w:r>
+        <w:br w:type="page"/>
+      </w:r>
     </w:p>
     <w:p>
       <w:pPr>
@@ -4407,8 +4453,18 @@
           <w:b/>
           <w:color w:val="0B3660"/>
         </w:rPr>
-        <w:t>File .cer dan .pvk</w:t>
-      </w:r>
+        <w:lastRenderedPageBreak/>
+        <w:t xml:space="preserve">File .cer </w:t>
+      </w:r>
+      <w:proofErr w:type="gramStart"/>
+      <w:r>
+        <w:rPr>
+          <w:b/>
+          <w:color w:val="0B3660"/>
+        </w:rPr>
+        <w:t>dan .pvk</w:t>
+      </w:r>
+      <w:proofErr w:type="gramEnd"/>
     </w:p>
     <w:p>
       <w:pPr>
@@ -4710,7 +4766,6 @@
                 <w:rFonts w:ascii="Consolas" w:eastAsia="Consolas" w:hAnsi="Consolas"/>
                 <w:sz w:val="19"/>
               </w:rPr>
-              <w:lastRenderedPageBreak/>
               <w:t>DROP DATABASE ENCRYPTION KEY</w:t>
             </w:r>
           </w:p>
@@ -5136,10 +5191,16 @@
       </w:pPr>
     </w:p>
     <w:p>
+      <w:r>
+        <w:br w:type="page"/>
+      </w:r>
+    </w:p>
+    <w:p>
       <w:pPr>
         <w:spacing w:after="160"/>
       </w:pPr>
       <w:r>
+        <w:lastRenderedPageBreak/>
         <w:t>Nilai encryption_state pada sys.dm_database_encryption_keys:</w:t>
       </w:r>
     </w:p>
@@ -5842,7 +5903,6 @@
         <w:spacing w:after="160"/>
       </w:pPr>
       <w:r>
-        <w:lastRenderedPageBreak/>
         <w:t>Untuk memastikan database dan log sudah terenkripsi, filter encryption_state = 3. Pada SQL Server 2019+, kolom encryption_scan_state dan encryption_scan_modify_date menunjukkan status scan (termasuk jika di-suspend).</w:t>
       </w:r>
     </w:p>
@@ -6073,6 +6133,7 @@
         <w:spacing w:after="160"/>
       </w:pPr>
       <w:r>
+        <w:lastRenderedPageBreak/>
         <w:t>Jika instance restart saat scan tersuspend, error log mencatat bahwa scan yang ada masih dijeda. Fitur Suspend/Resume tidak tersedia di Azure SQL Database, Azure SQL Managed Instance, dan Azure Synapse Analytics.</w:t>
       </w:r>
     </w:p>
@@ -6175,7 +6236,6 @@
         <w:spacing w:after="160"/>
       </w:pPr>
       <w:r>
-        <w:lastRenderedPageBreak/>
         <w:t>Pantau log dengan sys.dm_db_log_info. Kolom vlf_encryptor_thumbprint (Azure SQL dan SQL Server 2019+) menunjukkan apakah VLF terenkripsi. Sebelum DEK diganti, DEK lama masih mengenkripsi data yang ditulis ke transaction log. Jika DEK diganti dua kali, wajib log backup sebelum mengganti DEK lagi.</w:t>
       </w:r>
     </w:p>
@@ -6263,6 +6323,7 @@
           <w:color w:val="0078D4"/>
           <w:sz w:val="28"/>
         </w:rPr>
+        <w:lastRenderedPageBreak/>
         <w:t>7.5 FILESTREAM, Buffer Pool Extension, In-Memory OLTP</w:t>
       </w:r>
       <w:bookmarkEnd w:id="21"/>
@@ -6401,7 +6462,6 @@
         <w:spacing w:after="160"/>
       </w:pPr>
       <w:r>
-        <w:lastRenderedPageBreak/>
         <w:t>Selama CREATE/ALTER/DROP DATABASE ENCRYPTION KEY dan ALTER DATABASE … SET ENCRYPTION, tambahan larangan:</w:t>
       </w:r>
     </w:p>
@@ -6500,7 +6560,25 @@
         <w:spacing w:after="60" w:line="269" w:lineRule="auto"/>
       </w:pPr>
       <w:r>
-        <w:t>Tugas maintenance database sedang berjalan</w:t>
+        <w:t xml:space="preserve">Tugas maintenance database </w:t>
+      </w:r>
+      <w:proofErr w:type="spellStart"/>
+      <w:r>
+        <w:t>sedang</w:t>
+      </w:r>
+      <w:proofErr w:type="spellEnd"/>
+      <w:r>
+        <w:t xml:space="preserve"> </w:t>
+      </w:r>
+      <w:proofErr w:type="spellStart"/>
+      <w:r>
+        <w:t>berjalan</w:t>
+      </w:r>
+      <w:proofErr w:type="spellEnd"/>
+    </w:p>
+    <w:p>
+      <w:r>
+        <w:br w:type="page"/>
       </w:r>
     </w:p>
     <w:p>
@@ -6515,6 +6593,7 @@
           <w:color w:val="0B3660"/>
           <w:sz w:val="36"/>
         </w:rPr>
+        <w:lastRenderedPageBreak/>
         <w:t>9. Mengelola sertifikat TDE</w:t>
       </w:r>
       <w:bookmarkEnd w:id="24"/>
@@ -6713,10 +6792,19 @@
     <w:p>
       <w:pPr>
         <w:pStyle w:val="ListNumber"/>
+        <w:numPr>
+          <w:ilvl w:val="0"/>
+          <w:numId w:val="11"/>
+        </w:numPr>
         <w:spacing w:after="60" w:line="269" w:lineRule="auto"/>
       </w:pPr>
-      <w:r>
-        <w:t>Buat Database Master Key di master (jika belum ada).</w:t>
+      <w:proofErr w:type="spellStart"/>
+      <w:r>
+        <w:t>Buat</w:t>
+      </w:r>
+      <w:proofErr w:type="spellEnd"/>
+      <w:r>
+        <w:t xml:space="preserve"> Database Master Key di master (jika belum ada).</w:t>
       </w:r>
     </w:p>
     <w:p>
@@ -6764,7 +6852,6 @@
           <w:color w:val="1B1B1B"/>
           <w:sz w:val="18"/>
         </w:rPr>
-        <w:lastRenderedPageBreak/>
         <w:t>USE master;</w:t>
       </w:r>
     </w:p>
@@ -7256,10 +7343,22 @@
     <w:p>
       <w:pPr>
         <w:pStyle w:val="ListNumber"/>
+        <w:numPr>
+          <w:ilvl w:val="0"/>
+          <w:numId w:val="12"/>
+        </w:numPr>
         <w:spacing w:after="60" w:line="269" w:lineRule="auto"/>
       </w:pPr>
       <w:r>
-        <w:t>Pakai AES_256 (algoritma yang disarankan pada contoh Microsoft modern).</w:t>
+        <w:t>Pakai AES_256 (</w:t>
+      </w:r>
+      <w:proofErr w:type="spellStart"/>
+      <w:r>
+        <w:t>algoritma</w:t>
+      </w:r>
+      <w:proofErr w:type="spellEnd"/>
+      <w:r>
+        <w:t xml:space="preserve"> yang disarankan pada contoh Microsoft modern).</w:t>
       </w:r>
     </w:p>
     <w:p>
@@ -7322,7 +7421,6 @@
         <w:spacing w:after="60" w:line="269" w:lineRule="auto"/>
       </w:pPr>
       <w:r>
-        <w:lastRenderedPageBreak/>
         <w:t>FILESTREAM dan BPE tidak tercakup TDE — tambahkan enkripsi volume jika diperlukan.</w:t>
       </w:r>
     </w:p>
@@ -7341,7 +7439,44 @@
         <w:spacing w:after="60" w:line="269" w:lineRule="auto"/>
       </w:pPr>
       <w:r>
-        <w:t>Dokumentasikan password DMK, password private key, lokasi .cer/.pvk, dan siapa yang berwenang merestore.</w:t>
+        <w:t>Dokumentasikan password DMK, password private key, lokasi .cer</w:t>
+      </w:r>
+      <w:proofErr w:type="gramStart"/>
+      <w:r>
+        <w:t>/.pvk</w:t>
+      </w:r>
+      <w:proofErr w:type="gramEnd"/>
+      <w:r>
+        <w:t xml:space="preserve">, dan </w:t>
+      </w:r>
+      <w:proofErr w:type="spellStart"/>
+      <w:r>
+        <w:t>siapa</w:t>
+      </w:r>
+      <w:proofErr w:type="spellEnd"/>
+      <w:r>
+        <w:t xml:space="preserve"> yang </w:t>
+      </w:r>
+      <w:proofErr w:type="spellStart"/>
+      <w:r>
+        <w:t>berwenang</w:t>
+      </w:r>
+      <w:proofErr w:type="spellEnd"/>
+      <w:r>
+        <w:t xml:space="preserve"> </w:t>
+      </w:r>
+      <w:proofErr w:type="spellStart"/>
+      <w:r>
+        <w:t>merestore</w:t>
+      </w:r>
+      <w:proofErr w:type="spellEnd"/>
+      <w:r>
+        <w:t>.</w:t>
+      </w:r>
+    </w:p>
+    <w:p>
+      <w:r>
+        <w:br w:type="page"/>
       </w:r>
     </w:p>
     <w:p>
@@ -7356,6 +7491,7 @@
           <w:color w:val="0B3660"/>
           <w:sz w:val="36"/>
         </w:rPr>
+        <w:lastRenderedPageBreak/>
         <w:t>12. Referensi</w:t>
       </w:r>
       <w:bookmarkEnd w:id="28"/>
@@ -7467,7 +7603,7 @@
       </w:tblPr>
       <w:tblGrid>
         <w:gridCol w:w="2608"/>
-        <w:gridCol w:w="5216"/>
+        <w:gridCol w:w="5338"/>
         <w:gridCol w:w="1587"/>
       </w:tblGrid>
       <w:tr>
@@ -7527,14 +7663,34 @@
             <w:pPr>
               <w:spacing w:before="40" w:after="40" w:line="240" w:lineRule="auto"/>
             </w:pPr>
+            <w:proofErr w:type="spellStart"/>
             <w:r>
               <w:rPr>
                 <w:b/>
                 <w:color w:val="FFFFFF"/>
                 <w:sz w:val="20"/>
               </w:rPr>
-              <w:t>Perintah / bukti</w:t>
+              <w:t>Perintah</w:t>
             </w:r>
+            <w:proofErr w:type="spellEnd"/>
+            <w:r>
+              <w:rPr>
+                <w:b/>
+                <w:color w:val="FFFFFF"/>
+                <w:sz w:val="20"/>
+              </w:rPr>
+              <w:t xml:space="preserve"> / </w:t>
+            </w:r>
+            <w:proofErr w:type="spellStart"/>
+            <w:r>
+              <w:rPr>
+                <w:b/>
+                <w:color w:val="FFFFFF"/>
+                <w:sz w:val="20"/>
+              </w:rPr>
+              <w:t>bukti</w:t>
+            </w:r>
+            <w:proofErr w:type="spellEnd"/>
           </w:p>
         </w:tc>
         <w:tc>
@@ -7654,11 +7810,19 @@
             <w:pPr>
               <w:spacing w:before="40" w:after="40" w:line="252" w:lineRule="auto"/>
             </w:pPr>
+            <w:proofErr w:type="spellStart"/>
             <w:r>
               <w:rPr>
                 <w:sz w:val="19"/>
               </w:rPr>
-              <w:t>Selesai — ONLINE</w:t>
+              <w:t>Selesai</w:t>
+            </w:r>
+            <w:proofErr w:type="spellEnd"/>
+            <w:r>
+              <w:rPr>
+                <w:sz w:val="19"/>
+              </w:rPr>
+              <w:t xml:space="preserve"> — ONLINE</w:t>
             </w:r>
           </w:p>
         </w:tc>
@@ -7689,12 +7853,21 @@
             <w:pPr>
               <w:spacing w:before="40" w:after="40" w:line="252" w:lineRule="auto"/>
             </w:pPr>
+            <w:proofErr w:type="spellStart"/>
             <w:r>
               <w:rPr>
                 <w:rFonts w:ascii="Consolas" w:eastAsia="Consolas" w:hAnsi="Consolas"/>
                 <w:sz w:val="19"/>
               </w:rPr>
-              <w:t>Buat DMK di master</w:t>
+              <w:t>Buat</w:t>
+            </w:r>
+            <w:proofErr w:type="spellEnd"/>
+            <w:r>
+              <w:rPr>
+                <w:rFonts w:ascii="Consolas" w:eastAsia="Consolas" w:hAnsi="Consolas"/>
+                <w:sz w:val="19"/>
+              </w:rPr>
+              <w:t xml:space="preserve"> DMK di master</w:t>
             </w:r>
           </w:p>
         </w:tc>
@@ -7725,6 +7898,19 @@
               </w:rPr>
               <w:t>CREATE MASTER KEY ENCRYPTION BY PASSWORD</w:t>
             </w:r>
+            <w:r>
+              <w:rPr>
+                <w:sz w:val="19"/>
+              </w:rPr>
+              <w:br/>
+              <w:t>(</w:t>
+            </w:r>
+            <w:r>
+              <w:t>TDEmssql_2026!</w:t>
+            </w:r>
+            <w:r>
+              <w:t>)</w:t>
+            </w:r>
           </w:p>
         </w:tc>
         <w:tc>
@@ -7748,6 +7934,11 @@
             <w:pPr>
               <w:spacing w:before="40" w:after="40" w:line="252" w:lineRule="auto"/>
             </w:pPr>
+            <w:proofErr w:type="spellStart"/>
+            <w:r>
+              <w:t>Selesai</w:t>
+            </w:r>
+            <w:proofErr w:type="spellEnd"/>
           </w:p>
         </w:tc>
       </w:tr>
@@ -7777,12 +7968,37 @@
             <w:pPr>
               <w:spacing w:before="40" w:after="40" w:line="252" w:lineRule="auto"/>
             </w:pPr>
+            <w:proofErr w:type="spellStart"/>
             <w:r>
               <w:rPr>
                 <w:rFonts w:ascii="Consolas" w:eastAsia="Consolas" w:hAnsi="Consolas"/>
                 <w:sz w:val="19"/>
               </w:rPr>
-              <w:t>Buat sertifikat TDE</w:t>
+              <w:t>Buat</w:t>
+            </w:r>
+            <w:proofErr w:type="spellEnd"/>
+            <w:r>
+              <w:rPr>
+                <w:rFonts w:ascii="Consolas" w:eastAsia="Consolas" w:hAnsi="Consolas"/>
+                <w:sz w:val="19"/>
+              </w:rPr>
+              <w:t xml:space="preserve"> </w:t>
+            </w:r>
+            <w:proofErr w:type="spellStart"/>
+            <w:r>
+              <w:rPr>
+                <w:rFonts w:ascii="Consolas" w:eastAsia="Consolas" w:hAnsi="Consolas"/>
+                <w:sz w:val="19"/>
+              </w:rPr>
+              <w:t>sertifikat</w:t>
+            </w:r>
+            <w:proofErr w:type="spellEnd"/>
+            <w:r>
+              <w:rPr>
+                <w:rFonts w:ascii="Consolas" w:eastAsia="Consolas" w:hAnsi="Consolas"/>
+                <w:sz w:val="19"/>
+              </w:rPr>
+              <w:t xml:space="preserve"> TDE</w:t>
             </w:r>
           </w:p>
         </w:tc>
@@ -7836,6 +8052,11 @@
             <w:pPr>
               <w:spacing w:before="40" w:after="40" w:line="252" w:lineRule="auto"/>
             </w:pPr>
+            <w:proofErr w:type="spellStart"/>
+            <w:r>
+              <w:t>sudah</w:t>
+            </w:r>
+            <w:proofErr w:type="spellEnd"/>
           </w:p>
         </w:tc>
       </w:tr>
@@ -7870,8 +8091,42 @@
                 <w:rFonts w:ascii="Consolas" w:eastAsia="Consolas" w:hAnsi="Consolas"/>
                 <w:sz w:val="19"/>
               </w:rPr>
-              <w:t>Backup .cer + .pvk</w:t>
+              <w:t>Backup .</w:t>
             </w:r>
+            <w:proofErr w:type="spellStart"/>
+            <w:r>
+              <w:rPr>
+                <w:rFonts w:ascii="Consolas" w:eastAsia="Consolas" w:hAnsi="Consolas"/>
+                <w:sz w:val="19"/>
+              </w:rPr>
+              <w:t>cer</w:t>
+            </w:r>
+            <w:proofErr w:type="spellEnd"/>
+            <w:r>
+              <w:rPr>
+                <w:rFonts w:ascii="Consolas" w:eastAsia="Consolas" w:hAnsi="Consolas"/>
+                <w:sz w:val="19"/>
+              </w:rPr>
+              <w:t xml:space="preserve"> </w:t>
+            </w:r>
+            <w:proofErr w:type="gramStart"/>
+            <w:r>
+              <w:rPr>
+                <w:rFonts w:ascii="Consolas" w:eastAsia="Consolas" w:hAnsi="Consolas"/>
+                <w:sz w:val="19"/>
+              </w:rPr>
+              <w:t>+ .</w:t>
+            </w:r>
+            <w:proofErr w:type="spellStart"/>
+            <w:r>
+              <w:rPr>
+                <w:rFonts w:ascii="Consolas" w:eastAsia="Consolas" w:hAnsi="Consolas"/>
+                <w:sz w:val="19"/>
+              </w:rPr>
+              <w:t>pvk</w:t>
+            </w:r>
+            <w:proofErr w:type="spellEnd"/>
+            <w:proofErr w:type="gramEnd"/>
           </w:p>
         </w:tc>
         <w:tc>
@@ -7901,6 +8156,39 @@
               </w:rPr>
               <w:t>BACKUP CERTIFICATE … WITH PRIVATE KEY</w:t>
             </w:r>
+            <w:r>
+              <w:rPr>
+                <w:sz w:val="19"/>
+              </w:rPr>
+              <w:br/>
+              <w:t>(</w:t>
+            </w:r>
+            <w:r>
+              <w:rPr>
+                <w:sz w:val="19"/>
+              </w:rPr>
+              <w:t>E:\PT Seraphim Digital Technology\</w:t>
+            </w:r>
+            <w:proofErr w:type="spellStart"/>
+            <w:r>
+              <w:rPr>
+                <w:sz w:val="19"/>
+              </w:rPr>
+              <w:t>Dokumen</w:t>
+            </w:r>
+            <w:proofErr w:type="spellEnd"/>
+            <w:r>
+              <w:rPr>
+                <w:sz w:val="19"/>
+              </w:rPr>
+              <w:t>\Database\192.168.30.34\MSSQL\Certificate before DEK</w:t>
+            </w:r>
+            <w:r>
+              <w:rPr>
+                <w:sz w:val="19"/>
+              </w:rPr>
+              <w:t>)</w:t>
+            </w:r>
           </w:p>
         </w:tc>
         <w:tc>
@@ -7924,6 +8212,11 @@
             <w:pPr>
               <w:spacing w:before="40" w:after="40" w:line="252" w:lineRule="auto"/>
             </w:pPr>
+            <w:proofErr w:type="spellStart"/>
+            <w:r>
+              <w:t>Sudah</w:t>
+            </w:r>
+            <w:proofErr w:type="spellEnd"/>
           </w:p>
         </w:tc>
       </w:tr>
@@ -7958,7 +8251,39 @@
                 <w:rFonts w:ascii="Consolas" w:eastAsia="Consolas" w:hAnsi="Consolas"/>
                 <w:sz w:val="19"/>
               </w:rPr>
-              <w:t>Salin kunci ke vault</w:t>
+              <w:t xml:space="preserve">Salin </w:t>
+            </w:r>
+            <w:proofErr w:type="spellStart"/>
+            <w:r>
+              <w:rPr>
+                <w:rFonts w:ascii="Consolas" w:eastAsia="Consolas" w:hAnsi="Consolas"/>
+                <w:sz w:val="19"/>
+              </w:rPr>
+              <w:t>kunci</w:t>
+            </w:r>
+            <w:proofErr w:type="spellEnd"/>
+            <w:r>
+              <w:rPr>
+                <w:rFonts w:ascii="Consolas" w:eastAsia="Consolas" w:hAnsi="Consolas"/>
+                <w:sz w:val="19"/>
+              </w:rPr>
+              <w:t xml:space="preserve"> </w:t>
+            </w:r>
+            <w:proofErr w:type="spellStart"/>
+            <w:r>
+              <w:rPr>
+                <w:rFonts w:ascii="Consolas" w:eastAsia="Consolas" w:hAnsi="Consolas"/>
+                <w:sz w:val="19"/>
+              </w:rPr>
+              <w:t>ke</w:t>
+            </w:r>
+            <w:proofErr w:type="spellEnd"/>
+            <w:r>
+              <w:rPr>
+                <w:rFonts w:ascii="Consolas" w:eastAsia="Consolas" w:hAnsi="Consolas"/>
+                <w:sz w:val="19"/>
+              </w:rPr>
+              <w:t xml:space="preserve"> vault</w:t>
             </w:r>
           </w:p>
         </w:tc>
@@ -7987,7 +8312,49 @@
               <w:rPr>
                 <w:sz w:val="19"/>
               </w:rPr>
-              <w:t>Copy ke media offline, bukan hanya E:\MSSQL</w:t>
+              <w:t xml:space="preserve">Copy </w:t>
+            </w:r>
+            <w:proofErr w:type="spellStart"/>
+            <w:r>
+              <w:rPr>
+                <w:sz w:val="19"/>
+              </w:rPr>
+              <w:t>ke</w:t>
+            </w:r>
+            <w:proofErr w:type="spellEnd"/>
+            <w:r>
+              <w:rPr>
+                <w:sz w:val="19"/>
+              </w:rPr>
+              <w:t xml:space="preserve"> media offline, </w:t>
+            </w:r>
+            <w:proofErr w:type="spellStart"/>
+            <w:r>
+              <w:rPr>
+                <w:sz w:val="19"/>
+              </w:rPr>
+              <w:t>bukan</w:t>
+            </w:r>
+            <w:proofErr w:type="spellEnd"/>
+            <w:r>
+              <w:rPr>
+                <w:sz w:val="19"/>
+              </w:rPr>
+              <w:t xml:space="preserve"> </w:t>
+            </w:r>
+            <w:proofErr w:type="spellStart"/>
+            <w:r>
+              <w:rPr>
+                <w:sz w:val="19"/>
+              </w:rPr>
+              <w:t>hanya</w:t>
+            </w:r>
+            <w:proofErr w:type="spellEnd"/>
+            <w:r>
+              <w:rPr>
+                <w:sz w:val="19"/>
+              </w:rPr>
+              <w:t xml:space="preserve"> E:\MSSQL</w:t>
             </w:r>
           </w:p>
         </w:tc>
@@ -8041,12 +8408,21 @@
             <w:pPr>
               <w:spacing w:before="40" w:after="40" w:line="252" w:lineRule="auto"/>
             </w:pPr>
+            <w:proofErr w:type="spellStart"/>
             <w:r>
               <w:rPr>
                 <w:rFonts w:ascii="Consolas" w:eastAsia="Consolas" w:hAnsi="Consolas"/>
                 <w:sz w:val="19"/>
               </w:rPr>
-              <w:t>Buat DEK AES_256</w:t>
+              <w:t>Buat</w:t>
+            </w:r>
+            <w:proofErr w:type="spellEnd"/>
+            <w:r>
+              <w:rPr>
+                <w:rFonts w:ascii="Consolas" w:eastAsia="Consolas" w:hAnsi="Consolas"/>
+                <w:sz w:val="19"/>
+              </w:rPr>
+              <w:t xml:space="preserve"> DEK AES_256</w:t>
             </w:r>
           </w:p>
         </w:tc>
@@ -8100,6 +8476,11 @@
             <w:pPr>
               <w:spacing w:before="40" w:after="40" w:line="252" w:lineRule="auto"/>
             </w:pPr>
+            <w:proofErr w:type="spellStart"/>
+            <w:r>
+              <w:t>sudah</w:t>
+            </w:r>
+            <w:proofErr w:type="spellEnd"/>
           </w:p>
         </w:tc>
       </w:tr>
@@ -8129,12 +8510,21 @@
             <w:pPr>
               <w:spacing w:before="40" w:after="40" w:line="252" w:lineRule="auto"/>
             </w:pPr>
+            <w:proofErr w:type="spellStart"/>
             <w:r>
               <w:rPr>
                 <w:rFonts w:ascii="Consolas" w:eastAsia="Consolas" w:hAnsi="Consolas"/>
                 <w:sz w:val="19"/>
               </w:rPr>
-              <w:t>Nyalakan TDE</w:t>
+              <w:t>Nyalakan</w:t>
+            </w:r>
+            <w:proofErr w:type="spellEnd"/>
+            <w:r>
+              <w:rPr>
+                <w:rFonts w:ascii="Consolas" w:eastAsia="Consolas" w:hAnsi="Consolas"/>
+                <w:sz w:val="19"/>
+              </w:rPr>
+              <w:t xml:space="preserve"> TDE</w:t>
             </w:r>
           </w:p>
         </w:tc>
@@ -8188,6 +8578,11 @@
             <w:pPr>
               <w:spacing w:before="40" w:after="40" w:line="252" w:lineRule="auto"/>
             </w:pPr>
+            <w:proofErr w:type="spellStart"/>
+            <w:r>
+              <w:t>sudah</w:t>
+            </w:r>
+            <w:proofErr w:type="spellEnd"/>
           </w:p>
         </w:tc>
       </w:tr>
@@ -8217,12 +8612,21 @@
             <w:pPr>
               <w:spacing w:before="40" w:after="40" w:line="252" w:lineRule="auto"/>
             </w:pPr>
+            <w:proofErr w:type="spellStart"/>
             <w:r>
               <w:rPr>
                 <w:rFonts w:ascii="Consolas" w:eastAsia="Consolas" w:hAnsi="Consolas"/>
                 <w:sz w:val="19"/>
               </w:rPr>
-              <w:t>Tunggu scan 100%</w:t>
+              <w:t>Tunggu</w:t>
+            </w:r>
+            <w:proofErr w:type="spellEnd"/>
+            <w:r>
+              <w:rPr>
+                <w:rFonts w:ascii="Consolas" w:eastAsia="Consolas" w:hAnsi="Consolas"/>
+                <w:sz w:val="19"/>
+              </w:rPr>
+              <w:t xml:space="preserve"> scan 100%</w:t>
             </w:r>
           </w:p>
         </w:tc>
@@ -8247,11 +8651,33 @@
             <w:pPr>
               <w:spacing w:before="40" w:after="40" w:line="252" w:lineRule="auto"/>
             </w:pPr>
+            <w:proofErr w:type="spellStart"/>
             <w:r>
               <w:rPr>
                 <w:sz w:val="19"/>
               </w:rPr>
-              <w:t>percent_complete; encryption_state = 3</w:t>
+              <w:t>percent_complete</w:t>
+            </w:r>
+            <w:proofErr w:type="spellEnd"/>
+            <w:r>
+              <w:rPr>
+                <w:sz w:val="19"/>
+              </w:rPr>
+              <w:t xml:space="preserve">; </w:t>
+            </w:r>
+            <w:proofErr w:type="spellStart"/>
+            <w:r>
+              <w:rPr>
+                <w:sz w:val="19"/>
+              </w:rPr>
+              <w:t>encryption_state</w:t>
+            </w:r>
+            <w:proofErr w:type="spellEnd"/>
+            <w:r>
+              <w:rPr>
+                <w:sz w:val="19"/>
+              </w:rPr>
+              <w:t xml:space="preserve"> = 3</w:t>
             </w:r>
           </w:p>
         </w:tc>
@@ -8276,6 +8702,11 @@
             <w:pPr>
               <w:spacing w:before="40" w:after="40" w:line="252" w:lineRule="auto"/>
             </w:pPr>
+            <w:proofErr w:type="spellStart"/>
+            <w:r>
+              <w:t>sudah</w:t>
+            </w:r>
+            <w:proofErr w:type="spellEnd"/>
           </w:p>
         </w:tc>
       </w:tr>
@@ -8305,12 +8736,21 @@
             <w:pPr>
               <w:spacing w:before="40" w:after="40" w:line="252" w:lineRule="auto"/>
             </w:pPr>
+            <w:proofErr w:type="spellStart"/>
             <w:r>
               <w:rPr>
                 <w:rFonts w:ascii="Consolas" w:eastAsia="Consolas" w:hAnsi="Consolas"/>
                 <w:sz w:val="19"/>
               </w:rPr>
-              <w:t>Verifikasi log</w:t>
+              <w:t>Verifikasi</w:t>
+            </w:r>
+            <w:proofErr w:type="spellEnd"/>
+            <w:r>
+              <w:rPr>
+                <w:rFonts w:ascii="Consolas" w:eastAsia="Consolas" w:hAnsi="Consolas"/>
+                <w:sz w:val="19"/>
+              </w:rPr>
+              <w:t xml:space="preserve"> log</w:t>
             </w:r>
           </w:p>
         </w:tc>
@@ -8335,12 +8775,28 @@
             <w:pPr>
               <w:spacing w:before="40" w:after="40" w:line="252" w:lineRule="auto"/>
             </w:pPr>
+            <w:proofErr w:type="spellStart"/>
             <w:r>
               <w:rPr>
                 <w:sz w:val="19"/>
               </w:rPr>
-              <w:t>sys.dm_database_encryption_keys / sys.dm_db_log_info</w:t>
+              <w:t>sys.dm_database_encryption_keys</w:t>
             </w:r>
+            <w:proofErr w:type="spellEnd"/>
+            <w:r>
+              <w:rPr>
+                <w:sz w:val="19"/>
+              </w:rPr>
+              <w:t xml:space="preserve"> / </w:t>
+            </w:r>
+            <w:proofErr w:type="spellStart"/>
+            <w:r>
+              <w:rPr>
+                <w:sz w:val="19"/>
+              </w:rPr>
+              <w:t>sys.dm_db_log_info</w:t>
+            </w:r>
+            <w:proofErr w:type="spellEnd"/>
           </w:p>
         </w:tc>
         <w:tc>
@@ -8364,6 +8820,11 @@
             <w:pPr>
               <w:spacing w:before="40" w:after="40" w:line="252" w:lineRule="auto"/>
             </w:pPr>
+            <w:proofErr w:type="spellStart"/>
+            <w:r>
+              <w:t>sudah</w:t>
+            </w:r>
+            <w:proofErr w:type="spellEnd"/>
           </w:p>
         </w:tc>
       </w:tr>
@@ -8427,7 +8888,21 @@
               <w:rPr>
                 <w:sz w:val="19"/>
               </w:rPr>
-              <w:t>CREATE CERTIFICATE FROM FILE lalu attach/restore</w:t>
+              <w:t xml:space="preserve">CREATE CERTIFICATE FROM FILE </w:t>
+            </w:r>
+            <w:proofErr w:type="spellStart"/>
+            <w:r>
+              <w:rPr>
+                <w:sz w:val="19"/>
+              </w:rPr>
+              <w:t>lalu</w:t>
+            </w:r>
+            <w:proofErr w:type="spellEnd"/>
+            <w:r>
+              <w:rPr>
+                <w:sz w:val="19"/>
+              </w:rPr>
+              <w:t xml:space="preserve"> attach/restore</w:t>
             </w:r>
           </w:p>
         </w:tc>
@@ -8452,6 +8927,11 @@
             <w:pPr>
               <w:spacing w:before="40" w:after="40" w:line="252" w:lineRule="auto"/>
             </w:pPr>
+            <w:proofErr w:type="spellStart"/>
+            <w:r>
+              <w:t>sudah</w:t>
+            </w:r>
+            <w:proofErr w:type="spellEnd"/>
           </w:p>
         </w:tc>
       </w:tr>
@@ -8462,6 +8942,11 @@
       </w:pPr>
     </w:p>
     <w:p>
+      <w:r>
+        <w:br w:type="page"/>
+      </w:r>
+    </w:p>
+    <w:p>
       <w:pPr>
         <w:pStyle w:val="Heading1"/>
         <w:spacing w:before="320" w:after="120"/>
@@ -8473,6 +8958,7 @@
           <w:color w:val="0B3660"/>
           <w:sz w:val="36"/>
         </w:rPr>
+        <w:lastRenderedPageBreak/>
         <w:t xml:space="preserve">Lampiran B. File </w:t>
       </w:r>
       <w:proofErr w:type="spellStart"/>
@@ -8730,7 +9216,6 @@
                 <w:rFonts w:ascii="Consolas" w:eastAsia="Consolas" w:hAnsi="Consolas"/>
                 <w:sz w:val="19"/>
               </w:rPr>
-              <w:lastRenderedPageBreak/>
               <w:t>E:\MSSQL\StackOverflow2013_2.ndf</w:t>
             </w:r>
           </w:p>
@@ -9087,7 +9572,3646 @@
         <w:spacing w:after="160"/>
       </w:pPr>
       <w:r>
-        <w:t>TDE mengenkripsi kelima file tersebut at rest. Tanpa sertifikat di instance SQL Server, menyalin file ini ke server lain dan menjalankan FOR ATTACH tidak akan membuka data.</w:t>
+        <w:t xml:space="preserve">TDE mengenkripsi kelima file tersebut at rest. Tanpa sertifikat di instance SQL Server, menyalin file ini ke server lain dan menjalankan FOR ATTACH </w:t>
+      </w:r>
+      <w:proofErr w:type="spellStart"/>
+      <w:r>
+        <w:t>tidak</w:t>
+      </w:r>
+      <w:proofErr w:type="spellEnd"/>
+      <w:r>
+        <w:t xml:space="preserve"> </w:t>
+      </w:r>
+      <w:proofErr w:type="spellStart"/>
+      <w:r>
+        <w:t>akan</w:t>
+      </w:r>
+      <w:proofErr w:type="spellEnd"/>
+      <w:r>
+        <w:t xml:space="preserve"> </w:t>
+      </w:r>
+      <w:proofErr w:type="spellStart"/>
+      <w:r>
+        <w:t>membuka</w:t>
+      </w:r>
+      <w:proofErr w:type="spellEnd"/>
+      <w:r>
+        <w:t xml:space="preserve"> data</w:t>
+      </w:r>
+    </w:p>
+    <w:p>
+      <w:r>
+        <w:br w:type="page"/>
+      </w:r>
+    </w:p>
+    <w:p>
+      <w:pPr>
+        <w:spacing w:after="160"/>
+        <w:rPr>
+          <w:b/>
+          <w:bCs/>
+        </w:rPr>
+      </w:pPr>
+      <w:r>
+        <w:rPr>
+          <w:b/>
+          <w:bCs/>
+        </w:rPr>
+        <w:lastRenderedPageBreak/>
+        <w:t xml:space="preserve">1. Attach </w:t>
+      </w:r>
+      <w:proofErr w:type="spellStart"/>
+      <w:r>
+        <w:rPr>
+          <w:b/>
+          <w:bCs/>
+        </w:rPr>
+        <w:t>dari</w:t>
+      </w:r>
+      <w:proofErr w:type="spellEnd"/>
+      <w:r>
+        <w:rPr>
+          <w:b/>
+          <w:bCs/>
+        </w:rPr>
+        <w:t xml:space="preserve"> file .</w:t>
+      </w:r>
+      <w:proofErr w:type="spellStart"/>
+      <w:r>
+        <w:rPr>
+          <w:b/>
+          <w:bCs/>
+        </w:rPr>
+        <w:t>mdf</w:t>
+      </w:r>
+      <w:proofErr w:type="spellEnd"/>
+    </w:p>
+    <w:p>
+      <w:pPr>
+        <w:spacing w:after="160"/>
+      </w:pPr>
+      <w:proofErr w:type="spellStart"/>
+      <w:r>
+        <w:t>Misalnya</w:t>
+      </w:r>
+      <w:proofErr w:type="spellEnd"/>
+      <w:r>
+        <w:t xml:space="preserve"> file:</w:t>
+      </w:r>
+    </w:p>
+    <w:p>
+      <w:pPr>
+        <w:spacing w:after="160"/>
+      </w:pPr>
+      <w:r>
+        <w:t>E:\Database\SIAP.mdf</w:t>
+      </w:r>
+    </w:p>
+    <w:p>
+      <w:pPr>
+        <w:spacing w:after="160"/>
+      </w:pPr>
+      <w:proofErr w:type="spellStart"/>
+      <w:r>
+        <w:t>jalankan</w:t>
+      </w:r>
+      <w:proofErr w:type="spellEnd"/>
+      <w:r>
+        <w:t xml:space="preserve"> </w:t>
+      </w:r>
+      <w:proofErr w:type="spellStart"/>
+      <w:r>
+        <w:t>melalui</w:t>
+      </w:r>
+      <w:proofErr w:type="spellEnd"/>
+      <w:r>
+        <w:t xml:space="preserve"> </w:t>
+      </w:r>
+      <w:proofErr w:type="spellStart"/>
+      <w:r>
+        <w:t>sqlcmd</w:t>
+      </w:r>
+      <w:proofErr w:type="spellEnd"/>
+      <w:r>
+        <w:t xml:space="preserve"> </w:t>
+      </w:r>
+      <w:proofErr w:type="spellStart"/>
+      <w:r>
+        <w:t>atau</w:t>
+      </w:r>
+      <w:proofErr w:type="spellEnd"/>
+      <w:r>
+        <w:t xml:space="preserve"> </w:t>
+      </w:r>
+      <w:proofErr w:type="spellStart"/>
+      <w:r>
+        <w:t>DBeaver</w:t>
+      </w:r>
+      <w:proofErr w:type="spellEnd"/>
+      <w:r>
+        <w:t>:</w:t>
+      </w:r>
+    </w:p>
+    <w:p>
+      <w:pPr>
+        <w:spacing w:after="160"/>
+      </w:pPr>
+      <w:r>
+        <w:t>CREATE DATABASE SIAP</w:t>
+      </w:r>
+    </w:p>
+    <w:p>
+      <w:pPr>
+        <w:spacing w:after="160"/>
+      </w:pPr>
+      <w:r>
+        <w:t>ON</w:t>
+      </w:r>
+    </w:p>
+    <w:p>
+      <w:pPr>
+        <w:spacing w:after="160"/>
+      </w:pPr>
+      <w:r>
+        <w:t>(</w:t>
+      </w:r>
+    </w:p>
+    <w:p>
+      <w:pPr>
+        <w:spacing w:after="160"/>
+      </w:pPr>
+      <w:r>
+        <w:t xml:space="preserve">    FILENAME = 'E:\Database\</w:t>
+      </w:r>
+      <w:proofErr w:type="spellStart"/>
+      <w:r>
+        <w:t>SIAP.mdf</w:t>
+      </w:r>
+      <w:proofErr w:type="spellEnd"/>
+      <w:r>
+        <w:t>'</w:t>
+      </w:r>
+    </w:p>
+    <w:p>
+      <w:pPr>
+        <w:spacing w:after="160"/>
+      </w:pPr>
+      <w:r>
+        <w:t>)</w:t>
+      </w:r>
+    </w:p>
+    <w:p>
+      <w:pPr>
+        <w:spacing w:after="160"/>
+      </w:pPr>
+      <w:r>
+        <w:t>FOR ATTACH;</w:t>
+      </w:r>
+    </w:p>
+    <w:p>
+      <w:pPr>
+        <w:spacing w:after="160"/>
+      </w:pPr>
+      <w:r>
+        <w:t>GO</w:t>
+      </w:r>
+    </w:p>
+    <w:p>
+      <w:pPr>
+        <w:spacing w:after="160"/>
+      </w:pPr>
+    </w:p>
+    <w:p>
+      <w:pPr>
+        <w:spacing w:after="160"/>
+        <w:rPr>
+          <w:b/>
+          <w:bCs/>
+        </w:rPr>
+      </w:pPr>
+      <w:r>
+        <w:rPr>
+          <w:b/>
+          <w:bCs/>
+        </w:rPr>
+        <w:t xml:space="preserve">2. Jika </w:t>
+      </w:r>
+      <w:proofErr w:type="spellStart"/>
+      <w:r>
+        <w:rPr>
+          <w:b/>
+          <w:bCs/>
+        </w:rPr>
+        <w:t>ada</w:t>
+      </w:r>
+      <w:proofErr w:type="spellEnd"/>
+      <w:r>
+        <w:rPr>
+          <w:b/>
+          <w:bCs/>
+        </w:rPr>
+        <w:t xml:space="preserve"> file .</w:t>
+      </w:r>
+      <w:proofErr w:type="spellStart"/>
+      <w:r>
+        <w:rPr>
+          <w:b/>
+          <w:bCs/>
+        </w:rPr>
+        <w:t>ldf</w:t>
+      </w:r>
+      <w:proofErr w:type="spellEnd"/>
+    </w:p>
+    <w:p>
+      <w:pPr>
+        <w:spacing w:after="160"/>
+      </w:pPr>
+      <w:proofErr w:type="spellStart"/>
+      <w:r>
+        <w:t>Misalnya</w:t>
+      </w:r>
+      <w:proofErr w:type="spellEnd"/>
+      <w:r>
+        <w:t>:</w:t>
+      </w:r>
+    </w:p>
+    <w:p>
+      <w:pPr>
+        <w:spacing w:after="160"/>
+      </w:pPr>
+      <w:r>
+        <w:t>E:\Database\SIAP.mdf</w:t>
+      </w:r>
+    </w:p>
+    <w:p>
+      <w:pPr>
+        <w:spacing w:after="160"/>
+      </w:pPr>
+      <w:r>
+        <w:t>E:\Database\SIAP_log.ldf</w:t>
+      </w:r>
+    </w:p>
+    <w:p>
+      <w:pPr>
+        <w:spacing w:after="160"/>
+      </w:pPr>
+      <w:proofErr w:type="spellStart"/>
+      <w:r>
+        <w:t>gunakan</w:t>
+      </w:r>
+      <w:proofErr w:type="spellEnd"/>
+      <w:r>
+        <w:t>:</w:t>
+      </w:r>
+    </w:p>
+    <w:p>
+      <w:pPr>
+        <w:spacing w:after="160"/>
+      </w:pPr>
+      <w:r>
+        <w:t>CREATE DATABASE SIAP</w:t>
+      </w:r>
+    </w:p>
+    <w:p>
+      <w:pPr>
+        <w:spacing w:after="160"/>
+      </w:pPr>
+      <w:r>
+        <w:t>ON</w:t>
+      </w:r>
+    </w:p>
+    <w:p>
+      <w:pPr>
+        <w:spacing w:after="160"/>
+      </w:pPr>
+      <w:r>
+        <w:t>(</w:t>
+      </w:r>
+    </w:p>
+    <w:p>
+      <w:pPr>
+        <w:spacing w:after="160"/>
+      </w:pPr>
+      <w:r>
+        <w:t xml:space="preserve">    FILENAME = 'E:\Database\</w:t>
+      </w:r>
+      <w:proofErr w:type="spellStart"/>
+      <w:r>
+        <w:t>SIAP.mdf</w:t>
+      </w:r>
+      <w:proofErr w:type="spellEnd"/>
+      <w:r>
+        <w:t>'</w:t>
+      </w:r>
+    </w:p>
+    <w:p>
+      <w:pPr>
+        <w:spacing w:after="160"/>
+      </w:pPr>
+      <w:r>
+        <w:t>),</w:t>
+      </w:r>
+    </w:p>
+    <w:p>
+      <w:pPr>
+        <w:spacing w:after="160"/>
+      </w:pPr>
+      <w:r>
+        <w:t>(</w:t>
+      </w:r>
+    </w:p>
+    <w:p>
+      <w:pPr>
+        <w:spacing w:after="160"/>
+      </w:pPr>
+      <w:r>
+        <w:t xml:space="preserve">    FILENAME = 'E:\Database\</w:t>
+      </w:r>
+      <w:proofErr w:type="spellStart"/>
+      <w:r>
+        <w:t>SIAP_log.ldf</w:t>
+      </w:r>
+      <w:proofErr w:type="spellEnd"/>
+      <w:r>
+        <w:t>'</w:t>
+      </w:r>
+    </w:p>
+    <w:p>
+      <w:pPr>
+        <w:spacing w:after="160"/>
+      </w:pPr>
+      <w:r>
+        <w:t>)</w:t>
+      </w:r>
+    </w:p>
+    <w:p>
+      <w:pPr>
+        <w:spacing w:after="160"/>
+      </w:pPr>
+      <w:r>
+        <w:t>FOR ATTACH;</w:t>
+      </w:r>
+    </w:p>
+    <w:p>
+      <w:pPr>
+        <w:spacing w:after="160"/>
+      </w:pPr>
+      <w:r>
+        <w:t>GO</w:t>
+      </w:r>
+    </w:p>
+    <w:p>
+      <w:r>
+        <w:br w:type="page"/>
+      </w:r>
+    </w:p>
+    <w:p>
+      <w:pPr>
+        <w:spacing w:after="160"/>
+        <w:rPr>
+          <w:b/>
+          <w:bCs/>
+        </w:rPr>
+      </w:pPr>
+      <w:r>
+        <w:rPr>
+          <w:b/>
+          <w:bCs/>
+        </w:rPr>
+        <w:lastRenderedPageBreak/>
+        <w:t>3. Kalau file log .</w:t>
+      </w:r>
+      <w:proofErr w:type="spellStart"/>
+      <w:r>
+        <w:rPr>
+          <w:b/>
+          <w:bCs/>
+        </w:rPr>
+        <w:t>ldf</w:t>
+      </w:r>
+      <w:proofErr w:type="spellEnd"/>
+      <w:r>
+        <w:rPr>
+          <w:b/>
+          <w:bCs/>
+        </w:rPr>
+        <w:t xml:space="preserve"> </w:t>
+      </w:r>
+      <w:proofErr w:type="spellStart"/>
+      <w:r>
+        <w:rPr>
+          <w:b/>
+          <w:bCs/>
+        </w:rPr>
+        <w:t>tidak</w:t>
+      </w:r>
+      <w:proofErr w:type="spellEnd"/>
+      <w:r>
+        <w:rPr>
+          <w:b/>
+          <w:bCs/>
+        </w:rPr>
+        <w:t xml:space="preserve"> </w:t>
+      </w:r>
+      <w:proofErr w:type="spellStart"/>
+      <w:r>
+        <w:rPr>
+          <w:b/>
+          <w:bCs/>
+        </w:rPr>
+        <w:t>ada</w:t>
+      </w:r>
+      <w:proofErr w:type="spellEnd"/>
+    </w:p>
+    <w:p>
+      <w:pPr>
+        <w:spacing w:after="160"/>
+      </w:pPr>
+      <w:r>
+        <w:t xml:space="preserve">SQL Server </w:t>
+      </w:r>
+      <w:proofErr w:type="spellStart"/>
+      <w:r>
+        <w:t>dapat</w:t>
+      </w:r>
+      <w:proofErr w:type="spellEnd"/>
+      <w:r>
+        <w:t xml:space="preserve"> </w:t>
+      </w:r>
+      <w:proofErr w:type="spellStart"/>
+      <w:r>
+        <w:t>mencoba</w:t>
+      </w:r>
+      <w:proofErr w:type="spellEnd"/>
+      <w:r>
+        <w:t xml:space="preserve"> </w:t>
+      </w:r>
+      <w:proofErr w:type="spellStart"/>
+      <w:r>
+        <w:t>membuat</w:t>
+      </w:r>
+      <w:proofErr w:type="spellEnd"/>
+      <w:r>
+        <w:t xml:space="preserve"> </w:t>
+      </w:r>
+      <w:proofErr w:type="spellStart"/>
+      <w:r>
+        <w:t>ulang</w:t>
+      </w:r>
+      <w:proofErr w:type="spellEnd"/>
+      <w:r>
+        <w:t xml:space="preserve"> log:</w:t>
+      </w:r>
+    </w:p>
+    <w:p>
+      <w:pPr>
+        <w:spacing w:after="160"/>
+      </w:pPr>
+      <w:r>
+        <w:t>CREATE DATABASE SIAP</w:t>
+      </w:r>
+    </w:p>
+    <w:p>
+      <w:pPr>
+        <w:spacing w:after="160"/>
+      </w:pPr>
+      <w:r>
+        <w:t>ON</w:t>
+      </w:r>
+    </w:p>
+    <w:p>
+      <w:pPr>
+        <w:spacing w:after="160"/>
+      </w:pPr>
+      <w:r>
+        <w:t>(</w:t>
+      </w:r>
+    </w:p>
+    <w:p>
+      <w:pPr>
+        <w:spacing w:after="160"/>
+      </w:pPr>
+      <w:r>
+        <w:t xml:space="preserve">    FILENAME = 'E:\Database\</w:t>
+      </w:r>
+      <w:proofErr w:type="spellStart"/>
+      <w:r>
+        <w:t>SIAP.mdf</w:t>
+      </w:r>
+      <w:proofErr w:type="spellEnd"/>
+      <w:r>
+        <w:t>'</w:t>
+      </w:r>
+    </w:p>
+    <w:p>
+      <w:pPr>
+        <w:spacing w:after="160"/>
+      </w:pPr>
+      <w:r>
+        <w:t>)</w:t>
+      </w:r>
+    </w:p>
+    <w:p>
+      <w:pPr>
+        <w:spacing w:after="160"/>
+      </w:pPr>
+      <w:r>
+        <w:t>FOR ATTACH_REBUILD_LOG;</w:t>
+      </w:r>
+    </w:p>
+    <w:p>
+      <w:pPr>
+        <w:spacing w:after="160"/>
+      </w:pPr>
+      <w:r>
+        <w:t>GO</w:t>
+      </w:r>
+    </w:p>
+    <w:p>
+      <w:pPr>
+        <w:spacing w:after="160"/>
+      </w:pPr>
+      <w:proofErr w:type="spellStart"/>
+      <w:r>
+        <w:t>Catatan</w:t>
+      </w:r>
+      <w:proofErr w:type="spellEnd"/>
+      <w:r>
+        <w:t xml:space="preserve">: </w:t>
+      </w:r>
+      <w:proofErr w:type="spellStart"/>
+      <w:r>
+        <w:t>gunakan</w:t>
+      </w:r>
+      <w:proofErr w:type="spellEnd"/>
+      <w:r>
+        <w:t xml:space="preserve"> ATTACH_REBUILD_LOG </w:t>
+      </w:r>
+      <w:proofErr w:type="spellStart"/>
+      <w:r>
+        <w:t>hanya</w:t>
+      </w:r>
+      <w:proofErr w:type="spellEnd"/>
+      <w:r>
+        <w:t xml:space="preserve"> </w:t>
+      </w:r>
+      <w:proofErr w:type="spellStart"/>
+      <w:r>
+        <w:t>jika</w:t>
+      </w:r>
+      <w:proofErr w:type="spellEnd"/>
+      <w:r>
+        <w:t xml:space="preserve"> </w:t>
+      </w:r>
+      <w:proofErr w:type="spellStart"/>
+      <w:r>
+        <w:t>memang</w:t>
+      </w:r>
+      <w:proofErr w:type="spellEnd"/>
+      <w:r>
+        <w:t xml:space="preserve"> file log </w:t>
+      </w:r>
+      <w:proofErr w:type="spellStart"/>
+      <w:r>
+        <w:t>hilang</w:t>
+      </w:r>
+      <w:proofErr w:type="spellEnd"/>
+      <w:r>
+        <w:t xml:space="preserve"> dan database </w:t>
+      </w:r>
+      <w:proofErr w:type="spellStart"/>
+      <w:r>
+        <w:t>dalam</w:t>
+      </w:r>
+      <w:proofErr w:type="spellEnd"/>
+      <w:r>
+        <w:t xml:space="preserve"> </w:t>
+      </w:r>
+      <w:proofErr w:type="spellStart"/>
+      <w:r>
+        <w:t>kondisi</w:t>
+      </w:r>
+      <w:proofErr w:type="spellEnd"/>
+      <w:r>
+        <w:t xml:space="preserve"> yang </w:t>
+      </w:r>
+      <w:proofErr w:type="spellStart"/>
+      <w:r>
+        <w:t>memungkinkan</w:t>
+      </w:r>
+      <w:proofErr w:type="spellEnd"/>
+      <w:r>
+        <w:t>.</w:t>
+      </w:r>
+    </w:p>
+    <w:p>
+      <w:pPr>
+        <w:spacing w:after="160"/>
+      </w:pPr>
+    </w:p>
+    <w:p>
+      <w:pPr>
+        <w:spacing w:after="160"/>
+        <w:rPr>
+          <w:b/>
+          <w:bCs/>
+        </w:rPr>
+      </w:pPr>
+      <w:r>
+        <w:rPr>
+          <w:b/>
+          <w:bCs/>
+        </w:rPr>
+        <w:t xml:space="preserve">4. Cek </w:t>
+      </w:r>
+      <w:proofErr w:type="spellStart"/>
+      <w:r>
+        <w:rPr>
+          <w:b/>
+          <w:bCs/>
+        </w:rPr>
+        <w:t>hasil</w:t>
+      </w:r>
+      <w:proofErr w:type="spellEnd"/>
+      <w:r>
+        <w:rPr>
+          <w:b/>
+          <w:bCs/>
+        </w:rPr>
+        <w:t xml:space="preserve"> attach</w:t>
+      </w:r>
+    </w:p>
+    <w:p>
+      <w:pPr>
+        <w:spacing w:after="160"/>
+      </w:pPr>
+      <w:r>
+        <w:t>SELECT</w:t>
+      </w:r>
+    </w:p>
+    <w:p>
+      <w:pPr>
+        <w:spacing w:after="160"/>
+      </w:pPr>
+      <w:r>
+        <w:t xml:space="preserve">    name,</w:t>
+      </w:r>
+    </w:p>
+    <w:p>
+      <w:pPr>
+        <w:spacing w:after="160"/>
+      </w:pPr>
+      <w:r>
+        <w:t xml:space="preserve">    </w:t>
+      </w:r>
+      <w:proofErr w:type="spellStart"/>
+      <w:r>
+        <w:t>state_desc</w:t>
+      </w:r>
+      <w:proofErr w:type="spellEnd"/>
+      <w:r>
+        <w:t>,</w:t>
+      </w:r>
+    </w:p>
+    <w:p>
+      <w:pPr>
+        <w:spacing w:after="160"/>
+      </w:pPr>
+      <w:r>
+        <w:t xml:space="preserve">    </w:t>
+      </w:r>
+      <w:proofErr w:type="spellStart"/>
+      <w:r>
+        <w:t>recovery_model_desc</w:t>
+      </w:r>
+      <w:proofErr w:type="spellEnd"/>
+    </w:p>
+    <w:p>
+      <w:pPr>
+        <w:spacing w:after="160"/>
+      </w:pPr>
+      <w:r>
+        <w:t xml:space="preserve">FROM </w:t>
+      </w:r>
+      <w:proofErr w:type="spellStart"/>
+      <w:proofErr w:type="gramStart"/>
+      <w:r>
+        <w:t>sys.databases</w:t>
+      </w:r>
+      <w:proofErr w:type="spellEnd"/>
+      <w:proofErr w:type="gramEnd"/>
+    </w:p>
+    <w:p>
+      <w:pPr>
+        <w:spacing w:after="160"/>
+      </w:pPr>
+      <w:r>
+        <w:t>WHERE name = 'SIAP';</w:t>
+      </w:r>
+    </w:p>
+    <w:p>
+      <w:pPr>
+        <w:spacing w:after="160"/>
+      </w:pPr>
+      <w:r>
+        <w:t>Harus:</w:t>
+      </w:r>
+    </w:p>
+    <w:p>
+      <w:pPr>
+        <w:spacing w:after="160"/>
+      </w:pPr>
+      <w:r>
+        <w:t xml:space="preserve">name   </w:t>
+      </w:r>
+      <w:proofErr w:type="spellStart"/>
+      <w:r>
+        <w:t>state_desc</w:t>
+      </w:r>
+      <w:proofErr w:type="spellEnd"/>
+    </w:p>
+    <w:p>
+      <w:pPr>
+        <w:spacing w:after="160"/>
+      </w:pPr>
+      <w:r>
+        <w:t>SIAP   ONLINE</w:t>
+      </w:r>
+    </w:p>
+    <w:p>
+      <w:pPr>
+        <w:spacing w:after="160"/>
+      </w:pPr>
+    </w:p>
+    <w:p>
+      <w:pPr>
+        <w:spacing w:after="160"/>
+        <w:rPr>
+          <w:b/>
+          <w:bCs/>
+        </w:rPr>
+      </w:pPr>
+      <w:r>
+        <w:rPr>
+          <w:b/>
+          <w:bCs/>
+        </w:rPr>
+        <w:t xml:space="preserve">5. Jika </w:t>
+      </w:r>
+      <w:proofErr w:type="spellStart"/>
+      <w:r>
+        <w:rPr>
+          <w:b/>
+          <w:bCs/>
+        </w:rPr>
+        <w:t>muncul</w:t>
+      </w:r>
+      <w:proofErr w:type="spellEnd"/>
+      <w:r>
+        <w:rPr>
+          <w:b/>
+          <w:bCs/>
+        </w:rPr>
+        <w:t xml:space="preserve"> error permission</w:t>
+      </w:r>
+    </w:p>
+    <w:p>
+      <w:pPr>
+        <w:spacing w:after="160"/>
+      </w:pPr>
+      <w:r>
+        <w:t xml:space="preserve">SQL Server service account </w:t>
+      </w:r>
+      <w:proofErr w:type="spellStart"/>
+      <w:r>
+        <w:t>harus</w:t>
+      </w:r>
+      <w:proofErr w:type="spellEnd"/>
+      <w:r>
+        <w:t xml:space="preserve"> punya </w:t>
+      </w:r>
+      <w:proofErr w:type="spellStart"/>
+      <w:r>
+        <w:t>akses</w:t>
+      </w:r>
+      <w:proofErr w:type="spellEnd"/>
+      <w:r>
+        <w:t xml:space="preserve"> </w:t>
+      </w:r>
+      <w:proofErr w:type="spellStart"/>
+      <w:r>
+        <w:t>ke</w:t>
+      </w:r>
+      <w:proofErr w:type="spellEnd"/>
+      <w:r>
+        <w:t xml:space="preserve"> folder:</w:t>
+      </w:r>
+    </w:p>
+    <w:p>
+      <w:pPr>
+        <w:spacing w:after="160"/>
+      </w:pPr>
+      <w:r>
+        <w:t>E:\Database</w:t>
+      </w:r>
+    </w:p>
+    <w:p>
+      <w:pPr>
+        <w:spacing w:after="160"/>
+      </w:pPr>
+      <w:r>
+        <w:t xml:space="preserve">Anda </w:t>
+      </w:r>
+      <w:proofErr w:type="spellStart"/>
+      <w:r>
+        <w:t>bisa</w:t>
+      </w:r>
+      <w:proofErr w:type="spellEnd"/>
+      <w:r>
+        <w:t xml:space="preserve"> </w:t>
+      </w:r>
+      <w:proofErr w:type="spellStart"/>
+      <w:r>
+        <w:t>cek</w:t>
+      </w:r>
+      <w:proofErr w:type="spellEnd"/>
+      <w:r>
+        <w:t xml:space="preserve"> service SQL Server:</w:t>
+      </w:r>
+    </w:p>
+    <w:p>
+      <w:pPr>
+        <w:spacing w:after="160"/>
+      </w:pPr>
+      <w:r>
+        <w:t>SELECT</w:t>
+      </w:r>
+    </w:p>
+    <w:p>
+      <w:pPr>
+        <w:spacing w:after="160"/>
+      </w:pPr>
+      <w:r>
+        <w:t xml:space="preserve">    </w:t>
+      </w:r>
+      <w:proofErr w:type="spellStart"/>
+      <w:r>
+        <w:t>servicename</w:t>
+      </w:r>
+      <w:proofErr w:type="spellEnd"/>
+      <w:r>
+        <w:t>,</w:t>
+      </w:r>
+    </w:p>
+    <w:p>
+      <w:pPr>
+        <w:spacing w:after="160"/>
+      </w:pPr>
+      <w:r>
+        <w:t xml:space="preserve">    </w:t>
+      </w:r>
+      <w:proofErr w:type="spellStart"/>
+      <w:r>
+        <w:t>service_account</w:t>
+      </w:r>
+      <w:proofErr w:type="spellEnd"/>
+    </w:p>
+    <w:p>
+      <w:pPr>
+        <w:spacing w:after="160"/>
+      </w:pPr>
+      <w:r>
+        <w:t xml:space="preserve">FROM </w:t>
+      </w:r>
+      <w:proofErr w:type="spellStart"/>
+      <w:r>
+        <w:t>sys.dm_server_services</w:t>
+      </w:r>
+      <w:proofErr w:type="spellEnd"/>
+      <w:r>
+        <w:t>;</w:t>
+      </w:r>
+    </w:p>
+    <w:p>
+      <w:pPr>
+        <w:spacing w:after="160"/>
+        <w:rPr>
+          <w:b/>
+          <w:bCs/>
+        </w:rPr>
+      </w:pPr>
+    </w:p>
+    <w:p>
+      <w:pPr>
+        <w:spacing w:after="160"/>
+        <w:rPr>
+          <w:b/>
+          <w:bCs/>
+        </w:rPr>
+      </w:pPr>
+      <w:r>
+        <w:rPr>
+          <w:b/>
+          <w:bCs/>
+        </w:rPr>
+        <w:t>0. Cek instance &amp; database</w:t>
+      </w:r>
+    </w:p>
+    <w:p>
+      <w:pPr>
+        <w:spacing w:after="160"/>
+      </w:pPr>
+      <w:proofErr w:type="spellStart"/>
+      <w:r>
+        <w:t>sqlcmd</w:t>
+      </w:r>
+      <w:proofErr w:type="spellEnd"/>
+      <w:r>
+        <w:t xml:space="preserve"> -S localhost -E -Q "SELECT @@SERVERNAME AS instance, name, </w:t>
+      </w:r>
+      <w:proofErr w:type="spellStart"/>
+      <w:r>
+        <w:t>state_desc</w:t>
+      </w:r>
+      <w:proofErr w:type="spellEnd"/>
+      <w:r>
+        <w:t xml:space="preserve"> FROM </w:t>
+      </w:r>
+      <w:proofErr w:type="spellStart"/>
+      <w:proofErr w:type="gramStart"/>
+      <w:r>
+        <w:t>sys.databases</w:t>
+      </w:r>
+      <w:proofErr w:type="spellEnd"/>
+      <w:proofErr w:type="gramEnd"/>
+      <w:r>
+        <w:t xml:space="preserve"> WHERE name = N'StackOverflow2013';"</w:t>
+      </w:r>
+    </w:p>
+    <w:p>
+      <w:pPr>
+        <w:spacing w:after="160"/>
+      </w:pPr>
+      <w:r>
+        <w:t xml:space="preserve">Kalau instance named (Express), </w:t>
+      </w:r>
+      <w:proofErr w:type="spellStart"/>
+      <w:r>
+        <w:t>ganti</w:t>
+      </w:r>
+      <w:proofErr w:type="spellEnd"/>
+      <w:r>
+        <w:t> -S localhost </w:t>
+      </w:r>
+      <w:proofErr w:type="spellStart"/>
+      <w:r>
+        <w:t>jadi</w:t>
+      </w:r>
+      <w:proofErr w:type="spellEnd"/>
+      <w:r>
+        <w:t> -S localhost\SQLEXPRESS.</w:t>
+      </w:r>
+    </w:p>
+    <w:p>
+      <w:pPr>
+        <w:spacing w:after="160"/>
+      </w:pPr>
+      <w:r>
+        <w:pict w14:anchorId="0C96E58C">
+          <v:rect id="_x0000_i1025" style="width:0;height:1.5pt" o:hralign="center" o:hrstd="t" o:hr="t" fillcolor="#a0a0a0" stroked="f"/>
+        </w:pict>
+      </w:r>
+    </w:p>
+    <w:p>
+      <w:pPr>
+        <w:rPr>
+          <w:b/>
+          <w:bCs/>
+        </w:rPr>
+      </w:pPr>
+      <w:r>
+        <w:rPr>
+          <w:b/>
+          <w:bCs/>
+        </w:rPr>
+        <w:br w:type="page"/>
+      </w:r>
+    </w:p>
+    <w:p>
+      <w:pPr>
+        <w:spacing w:after="160"/>
+        <w:rPr>
+          <w:b/>
+          <w:bCs/>
+        </w:rPr>
+      </w:pPr>
+      <w:r>
+        <w:rPr>
+          <w:b/>
+          <w:bCs/>
+        </w:rPr>
+        <w:lastRenderedPageBreak/>
+        <w:t xml:space="preserve">1. </w:t>
+      </w:r>
+      <w:proofErr w:type="spellStart"/>
+      <w:r>
+        <w:rPr>
+          <w:b/>
+          <w:bCs/>
+        </w:rPr>
+        <w:t>Pastikan</w:t>
+      </w:r>
+      <w:proofErr w:type="spellEnd"/>
+      <w:r>
+        <w:rPr>
+          <w:b/>
+          <w:bCs/>
+        </w:rPr>
+        <w:t xml:space="preserve"> database </w:t>
+      </w:r>
+      <w:proofErr w:type="spellStart"/>
+      <w:r>
+        <w:rPr>
+          <w:b/>
+          <w:bCs/>
+        </w:rPr>
+        <w:t>bisa</w:t>
+      </w:r>
+      <w:proofErr w:type="spellEnd"/>
+      <w:r>
+        <w:rPr>
+          <w:b/>
+          <w:bCs/>
+        </w:rPr>
+        <w:t xml:space="preserve"> </w:t>
+      </w:r>
+      <w:proofErr w:type="spellStart"/>
+      <w:r>
+        <w:rPr>
+          <w:b/>
+          <w:bCs/>
+        </w:rPr>
+        <w:t>dipakai</w:t>
+      </w:r>
+      <w:proofErr w:type="spellEnd"/>
+      <w:r>
+        <w:rPr>
+          <w:b/>
+          <w:bCs/>
+        </w:rPr>
+        <w:t xml:space="preserve"> (</w:t>
+      </w:r>
+      <w:proofErr w:type="spellStart"/>
+      <w:r>
+        <w:rPr>
+          <w:b/>
+          <w:bCs/>
+        </w:rPr>
+        <w:t>sebelum</w:t>
+      </w:r>
+      <w:proofErr w:type="spellEnd"/>
+      <w:r>
+        <w:rPr>
+          <w:b/>
+          <w:bCs/>
+        </w:rPr>
+        <w:t xml:space="preserve"> TDE)</w:t>
+      </w:r>
+    </w:p>
+    <w:p>
+      <w:pPr>
+        <w:spacing w:after="160"/>
+      </w:pPr>
+      <w:proofErr w:type="spellStart"/>
+      <w:r>
+        <w:t>sqlcmd</w:t>
+      </w:r>
+      <w:proofErr w:type="spellEnd"/>
+      <w:r>
+        <w:t xml:space="preserve"> -S localhost -E -d StackOverflow2013 -Q "SELECT name FROM </w:t>
+      </w:r>
+      <w:proofErr w:type="spellStart"/>
+      <w:proofErr w:type="gramStart"/>
+      <w:r>
+        <w:t>sys.tables</w:t>
+      </w:r>
+      <w:proofErr w:type="spellEnd"/>
+      <w:proofErr w:type="gramEnd"/>
+      <w:r>
+        <w:t xml:space="preserve"> ORDER BY name;"</w:t>
+      </w:r>
+    </w:p>
+    <w:p>
+      <w:pPr>
+        <w:spacing w:after="160"/>
+      </w:pPr>
+      <w:proofErr w:type="spellStart"/>
+      <w:r>
+        <w:t>sqlcmd</w:t>
+      </w:r>
+      <w:proofErr w:type="spellEnd"/>
+      <w:r>
+        <w:t xml:space="preserve"> -S localhost -E -d StackOverflow2013 -Q "SELECT TOP 5 Id, DisplayName FROM </w:t>
+      </w:r>
+      <w:proofErr w:type="spellStart"/>
+      <w:proofErr w:type="gramStart"/>
+      <w:r>
+        <w:t>dbo.Users</w:t>
+      </w:r>
+      <w:proofErr w:type="spellEnd"/>
+      <w:proofErr w:type="gramEnd"/>
+      <w:r>
+        <w:t>;"</w:t>
+      </w:r>
+    </w:p>
+    <w:p>
+      <w:pPr>
+        <w:spacing w:after="160"/>
+      </w:pPr>
+      <w:r>
+        <w:t xml:space="preserve">Kalau query </w:t>
+      </w:r>
+      <w:proofErr w:type="spellStart"/>
+      <w:r>
+        <w:t>ini</w:t>
+      </w:r>
+      <w:proofErr w:type="spellEnd"/>
+      <w:r>
+        <w:t xml:space="preserve"> </w:t>
+      </w:r>
+      <w:proofErr w:type="spellStart"/>
+      <w:r>
+        <w:t>gagal</w:t>
+      </w:r>
+      <w:proofErr w:type="spellEnd"/>
+      <w:r>
+        <w:t xml:space="preserve">, </w:t>
+      </w:r>
+      <w:proofErr w:type="spellStart"/>
+      <w:r>
+        <w:t>jangan</w:t>
+      </w:r>
+      <w:proofErr w:type="spellEnd"/>
+      <w:r>
+        <w:t xml:space="preserve"> </w:t>
+      </w:r>
+      <w:proofErr w:type="spellStart"/>
+      <w:r>
+        <w:t>lanjut</w:t>
+      </w:r>
+      <w:proofErr w:type="spellEnd"/>
+      <w:r>
+        <w:t xml:space="preserve"> TDE — </w:t>
+      </w:r>
+      <w:proofErr w:type="spellStart"/>
+      <w:r>
+        <w:t>perbaiki</w:t>
+      </w:r>
+      <w:proofErr w:type="spellEnd"/>
+      <w:r>
+        <w:t xml:space="preserve"> </w:t>
+      </w:r>
+      <w:proofErr w:type="spellStart"/>
+      <w:r>
+        <w:t>akses</w:t>
+      </w:r>
+      <w:proofErr w:type="spellEnd"/>
+      <w:r>
+        <w:t xml:space="preserve"> </w:t>
+      </w:r>
+      <w:proofErr w:type="spellStart"/>
+      <w:r>
+        <w:t>dulu</w:t>
+      </w:r>
+      <w:proofErr w:type="spellEnd"/>
+      <w:r>
+        <w:t>.</w:t>
+      </w:r>
+    </w:p>
+    <w:p>
+      <w:pPr>
+        <w:spacing w:after="160"/>
+      </w:pPr>
+      <w:r>
+        <w:pict w14:anchorId="13F0D273">
+          <v:rect id="_x0000_i1026" style="width:0;height:1.5pt" o:hralign="center" o:hrstd="t" o:hr="t" fillcolor="#a0a0a0" stroked="f"/>
+        </w:pict>
+      </w:r>
+    </w:p>
+    <w:p>
+      <w:pPr>
+        <w:spacing w:after="160"/>
+        <w:rPr>
+          <w:b/>
+          <w:bCs/>
+        </w:rPr>
+      </w:pPr>
+      <w:r>
+        <w:rPr>
+          <w:b/>
+          <w:bCs/>
+        </w:rPr>
+        <w:t xml:space="preserve">2. </w:t>
+      </w:r>
+      <w:proofErr w:type="spellStart"/>
+      <w:r>
+        <w:rPr>
+          <w:b/>
+          <w:bCs/>
+        </w:rPr>
+        <w:t>Buat</w:t>
+      </w:r>
+      <w:proofErr w:type="spellEnd"/>
+      <w:r>
+        <w:rPr>
+          <w:b/>
+          <w:bCs/>
+        </w:rPr>
+        <w:t xml:space="preserve"> Database Master Key di master</w:t>
+      </w:r>
+    </w:p>
+    <w:p>
+      <w:pPr>
+        <w:spacing w:after="160"/>
+      </w:pPr>
+      <w:proofErr w:type="spellStart"/>
+      <w:r>
+        <w:t>Lewati</w:t>
+      </w:r>
+      <w:proofErr w:type="spellEnd"/>
+      <w:r>
+        <w:t xml:space="preserve"> </w:t>
+      </w:r>
+      <w:proofErr w:type="spellStart"/>
+      <w:r>
+        <w:t>langkah</w:t>
+      </w:r>
+      <w:proofErr w:type="spellEnd"/>
+      <w:r>
+        <w:t xml:space="preserve"> </w:t>
+      </w:r>
+      <w:proofErr w:type="spellStart"/>
+      <w:r>
+        <w:t>ini</w:t>
+      </w:r>
+      <w:proofErr w:type="spellEnd"/>
+      <w:r>
+        <w:t xml:space="preserve"> </w:t>
+      </w:r>
+      <w:proofErr w:type="spellStart"/>
+      <w:r>
+        <w:t>jika</w:t>
+      </w:r>
+      <w:proofErr w:type="spellEnd"/>
+      <w:r>
+        <w:t xml:space="preserve"> error </w:t>
+      </w:r>
+      <w:r>
+        <w:rPr>
+          <w:i/>
+          <w:iCs/>
+        </w:rPr>
+        <w:t>“There is already a master key”</w:t>
+      </w:r>
+      <w:r>
+        <w:t xml:space="preserve"> — </w:t>
+      </w:r>
+      <w:proofErr w:type="spellStart"/>
+      <w:r>
+        <w:t>itu</w:t>
+      </w:r>
+      <w:proofErr w:type="spellEnd"/>
+      <w:r>
+        <w:t xml:space="preserve"> </w:t>
+      </w:r>
+      <w:proofErr w:type="spellStart"/>
+      <w:r>
+        <w:t>berarti</w:t>
+      </w:r>
+      <w:proofErr w:type="spellEnd"/>
+      <w:r>
+        <w:t xml:space="preserve"> DMK </w:t>
+      </w:r>
+      <w:proofErr w:type="spellStart"/>
+      <w:r>
+        <w:t>sudah</w:t>
+      </w:r>
+      <w:proofErr w:type="spellEnd"/>
+      <w:r>
+        <w:t xml:space="preserve"> </w:t>
+      </w:r>
+      <w:proofErr w:type="spellStart"/>
+      <w:r>
+        <w:t>ada</w:t>
+      </w:r>
+      <w:proofErr w:type="spellEnd"/>
+      <w:r>
+        <w:t>.</w:t>
+      </w:r>
+    </w:p>
+    <w:p>
+      <w:pPr>
+        <w:spacing w:after="160"/>
+      </w:pPr>
+      <w:proofErr w:type="spellStart"/>
+      <w:r>
+        <w:t>sqlcmd</w:t>
+      </w:r>
+      <w:proofErr w:type="spellEnd"/>
+      <w:r>
+        <w:t xml:space="preserve"> -S localhost -E -Q "USE master; CREATE MASTER KEY ENCRYPTION BY PASSWORD = 'GantiPasswordKuat_2026!';"</w:t>
+      </w:r>
+    </w:p>
+    <w:p>
+      <w:pPr>
+        <w:spacing w:after="160"/>
+      </w:pPr>
+      <w:r>
+        <w:t xml:space="preserve">Ganti password </w:t>
+      </w:r>
+      <w:proofErr w:type="spellStart"/>
+      <w:r>
+        <w:t>itu</w:t>
+      </w:r>
+      <w:proofErr w:type="spellEnd"/>
+      <w:r>
+        <w:t xml:space="preserve">; </w:t>
+      </w:r>
+      <w:proofErr w:type="spellStart"/>
+      <w:r>
+        <w:t>simpan</w:t>
+      </w:r>
+      <w:proofErr w:type="spellEnd"/>
+      <w:r>
+        <w:t xml:space="preserve"> di vault. </w:t>
+      </w:r>
+      <w:proofErr w:type="spellStart"/>
+      <w:r>
+        <w:t>Jangan</w:t>
+      </w:r>
+      <w:proofErr w:type="spellEnd"/>
+      <w:r>
+        <w:t xml:space="preserve"> </w:t>
+      </w:r>
+      <w:proofErr w:type="spellStart"/>
+      <w:r>
+        <w:t>hilangkan</w:t>
+      </w:r>
+      <w:proofErr w:type="spellEnd"/>
+      <w:r>
+        <w:t>.</w:t>
+      </w:r>
+    </w:p>
+    <w:p>
+      <w:pPr>
+        <w:spacing w:after="160"/>
+      </w:pPr>
+      <w:r>
+        <w:pict w14:anchorId="18C64E29">
+          <v:rect id="_x0000_i1027" style="width:0;height:1.5pt" o:hralign="center" o:hrstd="t" o:hr="t" fillcolor="#a0a0a0" stroked="f"/>
+        </w:pict>
+      </w:r>
+    </w:p>
+    <w:p>
+      <w:pPr>
+        <w:spacing w:after="160"/>
+        <w:rPr>
+          <w:b/>
+          <w:bCs/>
+        </w:rPr>
+      </w:pPr>
+      <w:r>
+        <w:rPr>
+          <w:b/>
+          <w:bCs/>
+        </w:rPr>
+        <w:t xml:space="preserve">3. </w:t>
+      </w:r>
+      <w:proofErr w:type="spellStart"/>
+      <w:r>
+        <w:rPr>
+          <w:b/>
+          <w:bCs/>
+        </w:rPr>
+        <w:t>Buat</w:t>
+      </w:r>
+      <w:proofErr w:type="spellEnd"/>
+      <w:r>
+        <w:rPr>
+          <w:b/>
+          <w:bCs/>
+        </w:rPr>
+        <w:t xml:space="preserve"> </w:t>
+      </w:r>
+      <w:proofErr w:type="spellStart"/>
+      <w:r>
+        <w:rPr>
+          <w:b/>
+          <w:bCs/>
+        </w:rPr>
+        <w:t>sertifikat</w:t>
+      </w:r>
+      <w:proofErr w:type="spellEnd"/>
+      <w:r>
+        <w:rPr>
+          <w:b/>
+          <w:bCs/>
+        </w:rPr>
+        <w:t xml:space="preserve"> TDE</w:t>
+      </w:r>
+    </w:p>
+    <w:p>
+      <w:pPr>
+        <w:spacing w:after="160"/>
+      </w:pPr>
+      <w:proofErr w:type="spellStart"/>
+      <w:r>
+        <w:t>sqlcmd</w:t>
+      </w:r>
+      <w:proofErr w:type="spellEnd"/>
+      <w:r>
+        <w:t xml:space="preserve"> -S localhost -E -Q "USE master; CREATE CERTIFICATE TDE_StackOverflow2013_Cert WITH SUBJECT = 'TDE DEK certificate for StackOverflow2013';"</w:t>
+      </w:r>
+    </w:p>
+    <w:p>
+      <w:pPr>
+        <w:spacing w:after="160"/>
+      </w:pPr>
+      <w:r>
+        <w:pict w14:anchorId="0AB14035">
+          <v:rect id="_x0000_i1028" style="width:0;height:1.5pt" o:hralign="center" o:hrstd="t" o:hr="t" fillcolor="#a0a0a0" stroked="f"/>
+        </w:pict>
+      </w:r>
+    </w:p>
+    <w:p>
+      <w:pPr>
+        <w:spacing w:after="160"/>
+        <w:rPr>
+          <w:b/>
+          <w:bCs/>
+        </w:rPr>
+      </w:pPr>
+      <w:r>
+        <w:rPr>
+          <w:b/>
+          <w:bCs/>
+        </w:rPr>
+        <w:t xml:space="preserve">4. Backup </w:t>
+      </w:r>
+      <w:proofErr w:type="spellStart"/>
+      <w:r>
+        <w:rPr>
+          <w:b/>
+          <w:bCs/>
+        </w:rPr>
+        <w:t>sertifikat</w:t>
+      </w:r>
+      <w:proofErr w:type="spellEnd"/>
+      <w:r>
+        <w:rPr>
+          <w:b/>
+          <w:bCs/>
+        </w:rPr>
+        <w:t xml:space="preserve"> + private key (</w:t>
+      </w:r>
+      <w:proofErr w:type="spellStart"/>
+      <w:r>
+        <w:rPr>
+          <w:b/>
+          <w:bCs/>
+        </w:rPr>
+        <w:t>wajib</w:t>
+      </w:r>
+      <w:proofErr w:type="spellEnd"/>
+      <w:r>
+        <w:rPr>
+          <w:b/>
+          <w:bCs/>
+        </w:rPr>
+        <w:t xml:space="preserve">, </w:t>
+      </w:r>
+      <w:proofErr w:type="spellStart"/>
+      <w:r>
+        <w:rPr>
+          <w:b/>
+          <w:bCs/>
+        </w:rPr>
+        <w:t>sebelum</w:t>
+      </w:r>
+      <w:proofErr w:type="spellEnd"/>
+      <w:r>
+        <w:rPr>
+          <w:b/>
+          <w:bCs/>
+        </w:rPr>
+        <w:t xml:space="preserve"> DEK)</w:t>
+      </w:r>
+    </w:p>
+    <w:p>
+      <w:pPr>
+        <w:spacing w:after="160"/>
+      </w:pPr>
+      <w:proofErr w:type="spellStart"/>
+      <w:r>
+        <w:t>Tanpa</w:t>
+      </w:r>
+      <w:proofErr w:type="spellEnd"/>
+      <w:r>
+        <w:t xml:space="preserve"> file </w:t>
+      </w:r>
+      <w:proofErr w:type="spellStart"/>
+      <w:r>
+        <w:t>ini</w:t>
+      </w:r>
+      <w:proofErr w:type="spellEnd"/>
+      <w:r>
+        <w:t xml:space="preserve">, database </w:t>
+      </w:r>
+      <w:proofErr w:type="spellStart"/>
+      <w:r>
+        <w:t>tidak</w:t>
+      </w:r>
+      <w:proofErr w:type="spellEnd"/>
+      <w:r>
+        <w:t xml:space="preserve"> </w:t>
+      </w:r>
+      <w:proofErr w:type="spellStart"/>
+      <w:r>
+        <w:t>bisa</w:t>
+      </w:r>
+      <w:proofErr w:type="spellEnd"/>
+      <w:r>
+        <w:t xml:space="preserve"> di-attach/restore di server lain.</w:t>
+      </w:r>
+    </w:p>
+    <w:p>
+      <w:pPr>
+        <w:spacing w:after="160"/>
+      </w:pPr>
+      <w:proofErr w:type="spellStart"/>
+      <w:r>
+        <w:t>sqlcmd</w:t>
+      </w:r>
+      <w:proofErr w:type="spellEnd"/>
+      <w:r>
+        <w:t xml:space="preserve"> -S localhost -E -Q "USE master; BACKUP CERTIFICATE TDE_StackOverflow2013_Cert TO FILE = 'E:\MSSQL\TDE_StackOverflow2013_Cert.cer' WITH PRIVATE KEY (FILE = 'E:\MSSQL\TDE_StackOverflow2013_Cert.pvk', ENCRYPTION BY PASSWORD = 'GantiPasswordPrivateKey_2026!');"</w:t>
+      </w:r>
+    </w:p>
+    <w:p>
+      <w:pPr>
+        <w:spacing w:after="160"/>
+      </w:pPr>
+      <w:r>
+        <w:t xml:space="preserve">Cek file </w:t>
+      </w:r>
+      <w:proofErr w:type="spellStart"/>
+      <w:r>
+        <w:t>lalu</w:t>
+      </w:r>
+      <w:proofErr w:type="spellEnd"/>
+      <w:r>
+        <w:t> </w:t>
+      </w:r>
+      <w:proofErr w:type="spellStart"/>
+      <w:r>
+        <w:rPr>
+          <w:b/>
+          <w:bCs/>
+        </w:rPr>
+        <w:t>salin</w:t>
+      </w:r>
+      <w:proofErr w:type="spellEnd"/>
+      <w:r>
+        <w:rPr>
+          <w:b/>
+          <w:bCs/>
+        </w:rPr>
+        <w:t> .</w:t>
+      </w:r>
+      <w:proofErr w:type="spellStart"/>
+      <w:r>
+        <w:rPr>
+          <w:b/>
+          <w:bCs/>
+        </w:rPr>
+        <w:t>cer</w:t>
+      </w:r>
+      <w:proofErr w:type="spellEnd"/>
+      <w:r>
+        <w:rPr>
+          <w:b/>
+          <w:bCs/>
+        </w:rPr>
+        <w:t> </w:t>
+      </w:r>
+      <w:proofErr w:type="gramStart"/>
+      <w:r>
+        <w:rPr>
+          <w:b/>
+          <w:bCs/>
+        </w:rPr>
+        <w:t>dan .</w:t>
+      </w:r>
+      <w:proofErr w:type="spellStart"/>
+      <w:r>
+        <w:rPr>
+          <w:b/>
+          <w:bCs/>
+        </w:rPr>
+        <w:t>pvk</w:t>
+      </w:r>
+      <w:proofErr w:type="spellEnd"/>
+      <w:proofErr w:type="gramEnd"/>
+      <w:r>
+        <w:rPr>
+          <w:b/>
+          <w:bCs/>
+        </w:rPr>
+        <w:t> </w:t>
+      </w:r>
+      <w:proofErr w:type="spellStart"/>
+      <w:r>
+        <w:rPr>
+          <w:b/>
+          <w:bCs/>
+        </w:rPr>
+        <w:t>ke</w:t>
+      </w:r>
+      <w:proofErr w:type="spellEnd"/>
+      <w:r>
+        <w:rPr>
+          <w:b/>
+          <w:bCs/>
+        </w:rPr>
+        <w:t xml:space="preserve"> </w:t>
+      </w:r>
+      <w:proofErr w:type="spellStart"/>
+      <w:r>
+        <w:rPr>
+          <w:b/>
+          <w:bCs/>
+        </w:rPr>
+        <w:t>lokasi</w:t>
+      </w:r>
+      <w:proofErr w:type="spellEnd"/>
+      <w:r>
+        <w:rPr>
+          <w:b/>
+          <w:bCs/>
+        </w:rPr>
+        <w:t xml:space="preserve"> </w:t>
+      </w:r>
+      <w:proofErr w:type="spellStart"/>
+      <w:r>
+        <w:rPr>
+          <w:b/>
+          <w:bCs/>
+        </w:rPr>
+        <w:t>aman</w:t>
+      </w:r>
+      <w:proofErr w:type="spellEnd"/>
+      <w:r>
+        <w:rPr>
+          <w:b/>
+          <w:bCs/>
+        </w:rPr>
+        <w:t xml:space="preserve"> di </w:t>
+      </w:r>
+      <w:proofErr w:type="spellStart"/>
+      <w:r>
+        <w:rPr>
+          <w:b/>
+          <w:bCs/>
+        </w:rPr>
+        <w:t>luar</w:t>
+      </w:r>
+      <w:proofErr w:type="spellEnd"/>
+      <w:r>
+        <w:rPr>
+          <w:b/>
+          <w:bCs/>
+        </w:rPr>
+        <w:t> E:\MSSQL</w:t>
+      </w:r>
+      <w:r>
+        <w:t>:</w:t>
+      </w:r>
+    </w:p>
+    <w:p>
+      <w:pPr>
+        <w:spacing w:after="160"/>
+      </w:pPr>
+      <w:proofErr w:type="spellStart"/>
+      <w:r>
+        <w:t>dir</w:t>
+      </w:r>
+      <w:proofErr w:type="spellEnd"/>
+      <w:r>
+        <w:t xml:space="preserve"> </w:t>
+      </w:r>
+      <w:proofErr w:type="gramStart"/>
+      <w:r>
+        <w:t>E:\MSSQL\TDE_StackOverflow2013_Cert.*</w:t>
+      </w:r>
+      <w:proofErr w:type="gramEnd"/>
+    </w:p>
+    <w:p>
+      <w:pPr>
+        <w:spacing w:after="160"/>
+      </w:pPr>
+      <w:r>
+        <w:pict w14:anchorId="4CF8E567">
+          <v:rect id="_x0000_i1029" style="width:0;height:1.5pt" o:hralign="center" o:hrstd="t" o:hr="t" fillcolor="#a0a0a0" stroked="f"/>
+        </w:pict>
+      </w:r>
+    </w:p>
+    <w:p>
+      <w:pPr>
+        <w:spacing w:after="160"/>
+        <w:rPr>
+          <w:b/>
+          <w:bCs/>
+        </w:rPr>
+      </w:pPr>
+      <w:r>
+        <w:rPr>
+          <w:b/>
+          <w:bCs/>
+        </w:rPr>
+        <w:t xml:space="preserve">5. </w:t>
+      </w:r>
+      <w:proofErr w:type="spellStart"/>
+      <w:r>
+        <w:rPr>
+          <w:b/>
+          <w:bCs/>
+        </w:rPr>
+        <w:t>Buat</w:t>
+      </w:r>
+      <w:proofErr w:type="spellEnd"/>
+      <w:r>
+        <w:rPr>
+          <w:b/>
+          <w:bCs/>
+        </w:rPr>
+        <w:t xml:space="preserve"> Database Encryption Key (AES-256)</w:t>
+      </w:r>
+    </w:p>
+    <w:p>
+      <w:pPr>
+        <w:spacing w:after="160"/>
+      </w:pPr>
+      <w:proofErr w:type="spellStart"/>
+      <w:r>
+        <w:t>sqlcmd</w:t>
+      </w:r>
+      <w:proofErr w:type="spellEnd"/>
+      <w:r>
+        <w:t xml:space="preserve"> -S localhost -E -Q "USE StackOverflow2013; CREATE DATABASE ENCRYPTION KEY WITH ALGORITHM = AES_256 ENCRYPTION BY SERVER CERTIFICATE TDE_StackOverflow2013_Cert;"</w:t>
+      </w:r>
+    </w:p>
+    <w:p>
+      <w:pPr>
+        <w:spacing w:after="160"/>
+      </w:pPr>
+      <w:proofErr w:type="spellStart"/>
+      <w:r>
+        <w:t>Peringatan</w:t>
+      </w:r>
+      <w:proofErr w:type="spellEnd"/>
+      <w:r>
+        <w:t> </w:t>
+      </w:r>
+      <w:r>
+        <w:rPr>
+          <w:i/>
+          <w:iCs/>
+        </w:rPr>
+        <w:t>certificate has not been backed up</w:t>
+      </w:r>
+      <w:r>
+        <w:t xml:space="preserve"> (33091) </w:t>
+      </w:r>
+      <w:proofErr w:type="spellStart"/>
+      <w:r>
+        <w:t>boleh</w:t>
+      </w:r>
+      <w:proofErr w:type="spellEnd"/>
+      <w:r>
+        <w:t xml:space="preserve"> </w:t>
+      </w:r>
+      <w:proofErr w:type="spellStart"/>
+      <w:r>
+        <w:t>diabaikan</w:t>
+      </w:r>
+      <w:proofErr w:type="spellEnd"/>
+      <w:r>
+        <w:t> </w:t>
+      </w:r>
+      <w:proofErr w:type="spellStart"/>
+      <w:r>
+        <w:rPr>
+          <w:b/>
+          <w:bCs/>
+        </w:rPr>
+        <w:t>hanya</w:t>
+      </w:r>
+      <w:proofErr w:type="spellEnd"/>
+      <w:r>
+        <w:rPr>
+          <w:b/>
+          <w:bCs/>
+        </w:rPr>
+        <w:t xml:space="preserve"> </w:t>
+      </w:r>
+      <w:proofErr w:type="spellStart"/>
+      <w:r>
+        <w:rPr>
+          <w:b/>
+          <w:bCs/>
+        </w:rPr>
+        <w:t>jika</w:t>
+      </w:r>
+      <w:proofErr w:type="spellEnd"/>
+      <w:r>
+        <w:t> </w:t>
+      </w:r>
+      <w:proofErr w:type="spellStart"/>
+      <w:r>
+        <w:t>langkah</w:t>
+      </w:r>
+      <w:proofErr w:type="spellEnd"/>
+      <w:r>
+        <w:t xml:space="preserve"> 4 </w:t>
+      </w:r>
+      <w:proofErr w:type="spellStart"/>
+      <w:r>
+        <w:t>sudah</w:t>
+      </w:r>
+      <w:proofErr w:type="spellEnd"/>
+      <w:r>
+        <w:t xml:space="preserve"> </w:t>
+      </w:r>
+      <w:proofErr w:type="spellStart"/>
+      <w:r>
+        <w:t>sukses</w:t>
+      </w:r>
+      <w:proofErr w:type="spellEnd"/>
+      <w:r>
+        <w:t>.</w:t>
+      </w:r>
+    </w:p>
+    <w:p>
+      <w:pPr>
+        <w:spacing w:after="160"/>
+      </w:pPr>
+      <w:r>
+        <w:pict w14:anchorId="03858A72">
+          <v:rect id="_x0000_i1030" style="width:0;height:1.5pt" o:hralign="center" o:hrstd="t" o:hr="t" fillcolor="#a0a0a0" stroked="f"/>
+        </w:pict>
+      </w:r>
+    </w:p>
+    <w:p>
+      <w:pPr>
+        <w:spacing w:after="160"/>
+        <w:rPr>
+          <w:b/>
+          <w:bCs/>
+        </w:rPr>
+      </w:pPr>
+      <w:r>
+        <w:rPr>
+          <w:b/>
+          <w:bCs/>
+        </w:rPr>
+        <w:t xml:space="preserve">6. </w:t>
+      </w:r>
+      <w:proofErr w:type="spellStart"/>
+      <w:r>
+        <w:rPr>
+          <w:b/>
+          <w:bCs/>
+        </w:rPr>
+        <w:t>Nyalakan</w:t>
+      </w:r>
+      <w:proofErr w:type="spellEnd"/>
+      <w:r>
+        <w:rPr>
+          <w:b/>
+          <w:bCs/>
+        </w:rPr>
+        <w:t xml:space="preserve"> TDE</w:t>
+      </w:r>
+    </w:p>
+    <w:p>
+      <w:pPr>
+        <w:spacing w:after="160"/>
+      </w:pPr>
+      <w:proofErr w:type="spellStart"/>
+      <w:r>
+        <w:t>sqlcmd</w:t>
+      </w:r>
+      <w:proofErr w:type="spellEnd"/>
+      <w:r>
+        <w:t xml:space="preserve"> -S localhost -E -Q "ALTER DATABASE StackOverflow2013 SET ENCRYPTION ON;"</w:t>
+      </w:r>
+    </w:p>
+    <w:p>
+      <w:pPr>
+        <w:spacing w:after="160"/>
+      </w:pPr>
+      <w:r>
+        <w:t xml:space="preserve">Scan ~55 GB </w:t>
+      </w:r>
+      <w:proofErr w:type="spellStart"/>
+      <w:r>
+        <w:t>bisa</w:t>
+      </w:r>
+      <w:proofErr w:type="spellEnd"/>
+      <w:r>
+        <w:t xml:space="preserve"> </w:t>
+      </w:r>
+      <w:proofErr w:type="spellStart"/>
+      <w:r>
+        <w:t>berlangsung</w:t>
+      </w:r>
+      <w:proofErr w:type="spellEnd"/>
+      <w:r>
+        <w:t xml:space="preserve"> lama (</w:t>
+      </w:r>
+      <w:proofErr w:type="spellStart"/>
+      <w:r>
+        <w:t>puluhan</w:t>
+      </w:r>
+      <w:proofErr w:type="spellEnd"/>
+      <w:r>
+        <w:t xml:space="preserve"> </w:t>
+      </w:r>
+      <w:proofErr w:type="spellStart"/>
+      <w:r>
+        <w:t>menit</w:t>
+      </w:r>
+      <w:proofErr w:type="spellEnd"/>
+      <w:r>
+        <w:t xml:space="preserve"> </w:t>
+      </w:r>
+      <w:proofErr w:type="spellStart"/>
+      <w:r>
+        <w:t>sampai</w:t>
+      </w:r>
+      <w:proofErr w:type="spellEnd"/>
+      <w:r>
+        <w:t xml:space="preserve"> </w:t>
+      </w:r>
+      <w:proofErr w:type="spellStart"/>
+      <w:r>
+        <w:t>beberapa</w:t>
+      </w:r>
+      <w:proofErr w:type="spellEnd"/>
+      <w:r>
+        <w:t xml:space="preserve"> jam, </w:t>
+      </w:r>
+      <w:proofErr w:type="spellStart"/>
+      <w:r>
+        <w:t>tergantung</w:t>
+      </w:r>
+      <w:proofErr w:type="spellEnd"/>
+      <w:r>
+        <w:t xml:space="preserve"> disk).</w:t>
+      </w:r>
+    </w:p>
+    <w:p>
+      <w:pPr>
+        <w:spacing w:after="160"/>
+      </w:pPr>
+      <w:r>
+        <w:lastRenderedPageBreak/>
+        <w:pict w14:anchorId="351CEBB7">
+          <v:rect id="_x0000_i1031" style="width:0;height:1.5pt" o:hralign="center" o:hrstd="t" o:hr="t" fillcolor="#a0a0a0" stroked="f"/>
+        </w:pict>
+      </w:r>
+    </w:p>
+    <w:p>
+      <w:pPr>
+        <w:spacing w:after="160"/>
+        <w:rPr>
+          <w:b/>
+          <w:bCs/>
+        </w:rPr>
+      </w:pPr>
+      <w:r>
+        <w:rPr>
+          <w:b/>
+          <w:bCs/>
+        </w:rPr>
+        <w:t xml:space="preserve">7. </w:t>
+      </w:r>
+      <w:proofErr w:type="spellStart"/>
+      <w:r>
+        <w:rPr>
+          <w:b/>
+          <w:bCs/>
+        </w:rPr>
+        <w:t>Pantau</w:t>
+      </w:r>
+      <w:proofErr w:type="spellEnd"/>
+      <w:r>
+        <w:rPr>
+          <w:b/>
+          <w:bCs/>
+        </w:rPr>
+        <w:t xml:space="preserve"> scan </w:t>
+      </w:r>
+      <w:proofErr w:type="spellStart"/>
+      <w:r>
+        <w:rPr>
+          <w:b/>
+          <w:bCs/>
+        </w:rPr>
+        <w:t>sampai</w:t>
+      </w:r>
+      <w:proofErr w:type="spellEnd"/>
+      <w:r>
+        <w:rPr>
+          <w:b/>
+          <w:bCs/>
+        </w:rPr>
+        <w:t xml:space="preserve"> </w:t>
+      </w:r>
+      <w:proofErr w:type="spellStart"/>
+      <w:r>
+        <w:rPr>
+          <w:b/>
+          <w:bCs/>
+        </w:rPr>
+        <w:t>selesai</w:t>
+      </w:r>
+      <w:proofErr w:type="spellEnd"/>
+    </w:p>
+    <w:p>
+      <w:pPr>
+        <w:spacing w:after="160"/>
+      </w:pPr>
+      <w:proofErr w:type="spellStart"/>
+      <w:r>
+        <w:t>Ulangi</w:t>
+      </w:r>
+      <w:proofErr w:type="spellEnd"/>
+      <w:r>
+        <w:t xml:space="preserve"> </w:t>
+      </w:r>
+      <w:proofErr w:type="spellStart"/>
+      <w:r>
+        <w:t>sampai</w:t>
+      </w:r>
+      <w:proofErr w:type="spellEnd"/>
+      <w:r>
+        <w:t> </w:t>
+      </w:r>
+      <w:proofErr w:type="spellStart"/>
+      <w:r>
+        <w:t>encryption_state</w:t>
+      </w:r>
+      <w:proofErr w:type="spellEnd"/>
+      <w:r>
+        <w:t xml:space="preserve"> = 3 dan </w:t>
+      </w:r>
+      <w:proofErr w:type="spellStart"/>
+      <w:r>
+        <w:t>percent_complete</w:t>
+      </w:r>
+      <w:proofErr w:type="spellEnd"/>
+      <w:r>
+        <w:t xml:space="preserve"> = 0 (</w:t>
+      </w:r>
+      <w:proofErr w:type="spellStart"/>
+      <w:r>
+        <w:t>selesai</w:t>
+      </w:r>
+      <w:proofErr w:type="spellEnd"/>
+      <w:r>
+        <w:t xml:space="preserve">; </w:t>
+      </w:r>
+      <w:proofErr w:type="spellStart"/>
+      <w:r>
+        <w:t>selama</w:t>
+      </w:r>
+      <w:proofErr w:type="spellEnd"/>
+      <w:r>
+        <w:t xml:space="preserve"> scan, percent &gt; 0 dan state = 2):</w:t>
+      </w:r>
+    </w:p>
+    <w:p>
+      <w:pPr>
+        <w:spacing w:after="160"/>
+      </w:pPr>
+      <w:proofErr w:type="spellStart"/>
+      <w:r>
+        <w:t>sqlcmd</w:t>
+      </w:r>
+      <w:proofErr w:type="spellEnd"/>
+      <w:r>
+        <w:t xml:space="preserve"> -S localhost -E -Q "SELECT DB_</w:t>
+      </w:r>
+      <w:proofErr w:type="gramStart"/>
+      <w:r>
+        <w:t>NAME(</w:t>
+      </w:r>
+      <w:proofErr w:type="spellStart"/>
+      <w:proofErr w:type="gramEnd"/>
+      <w:r>
+        <w:t>database_id</w:t>
+      </w:r>
+      <w:proofErr w:type="spellEnd"/>
+      <w:r>
+        <w:t xml:space="preserve">) AS </w:t>
+      </w:r>
+      <w:proofErr w:type="spellStart"/>
+      <w:r>
+        <w:t>db</w:t>
+      </w:r>
+      <w:proofErr w:type="spellEnd"/>
+      <w:r>
+        <w:t xml:space="preserve">, </w:t>
+      </w:r>
+      <w:proofErr w:type="spellStart"/>
+      <w:r>
+        <w:t>encryption_state</w:t>
+      </w:r>
+      <w:proofErr w:type="spellEnd"/>
+      <w:r>
+        <w:t xml:space="preserve">, </w:t>
+      </w:r>
+      <w:proofErr w:type="spellStart"/>
+      <w:r>
+        <w:t>percent_complete</w:t>
+      </w:r>
+      <w:proofErr w:type="spellEnd"/>
+      <w:r>
+        <w:t xml:space="preserve">, </w:t>
+      </w:r>
+      <w:proofErr w:type="spellStart"/>
+      <w:r>
+        <w:t>key_algorithm</w:t>
+      </w:r>
+      <w:proofErr w:type="spellEnd"/>
+      <w:r>
+        <w:t xml:space="preserve">, </w:t>
+      </w:r>
+      <w:proofErr w:type="spellStart"/>
+      <w:r>
+        <w:t>key_length</w:t>
+      </w:r>
+      <w:proofErr w:type="spellEnd"/>
+      <w:r>
+        <w:t xml:space="preserve"> FROM </w:t>
+      </w:r>
+      <w:proofErr w:type="spellStart"/>
+      <w:r>
+        <w:t>sys.dm_database_encryption_keys</w:t>
+      </w:r>
+      <w:proofErr w:type="spellEnd"/>
+      <w:r>
+        <w:t>;"</w:t>
+      </w:r>
+    </w:p>
+    <w:tbl>
+      <w:tblPr>
+        <w:tblW w:w="0" w:type="auto"/>
+        <w:tblCellMar>
+          <w:top w:w="15" w:type="dxa"/>
+          <w:left w:w="15" w:type="dxa"/>
+          <w:bottom w:w="15" w:type="dxa"/>
+          <w:right w:w="15" w:type="dxa"/>
+        </w:tblCellMar>
+        <w:tblLook w:val="04A0" w:firstRow="1" w:lastRow="0" w:firstColumn="1" w:lastColumn="0" w:noHBand="0" w:noVBand="1"/>
+      </w:tblPr>
+      <w:tblGrid>
+        <w:gridCol w:w="1828"/>
+        <w:gridCol w:w="3563"/>
+      </w:tblGrid>
+      <w:tr>
+        <w:trPr>
+          <w:tblHeader/>
+        </w:trPr>
+        <w:tc>
+          <w:tcPr>
+            <w:tcW w:w="0" w:type="auto"/>
+            <w:noWrap/>
+            <w:tcMar>
+              <w:top w:w="75" w:type="dxa"/>
+              <w:left w:w="135" w:type="dxa"/>
+              <w:bottom w:w="75" w:type="dxa"/>
+              <w:right w:w="135" w:type="dxa"/>
+            </w:tcMar>
+            <w:hideMark/>
+          </w:tcPr>
+          <w:p>
+            <w:pPr>
+              <w:spacing w:after="160"/>
+              <w:rPr>
+                <w:b/>
+                <w:bCs/>
+              </w:rPr>
+            </w:pPr>
+            <w:proofErr w:type="spellStart"/>
+            <w:r>
+              <w:rPr>
+                <w:b/>
+                <w:bCs/>
+              </w:rPr>
+              <w:t>encryption_state</w:t>
+            </w:r>
+            <w:proofErr w:type="spellEnd"/>
+          </w:p>
+        </w:tc>
+        <w:tc>
+          <w:tcPr>
+            <w:tcW w:w="0" w:type="auto"/>
+            <w:noWrap/>
+            <w:tcMar>
+              <w:top w:w="75" w:type="dxa"/>
+              <w:left w:w="135" w:type="dxa"/>
+              <w:bottom w:w="75" w:type="dxa"/>
+              <w:right w:w="135" w:type="dxa"/>
+            </w:tcMar>
+            <w:hideMark/>
+          </w:tcPr>
+          <w:p>
+            <w:pPr>
+              <w:spacing w:after="160"/>
+              <w:rPr>
+                <w:b/>
+                <w:bCs/>
+              </w:rPr>
+            </w:pPr>
+            <w:r>
+              <w:rPr>
+                <w:b/>
+                <w:bCs/>
+              </w:rPr>
+              <w:t>Arti</w:t>
+            </w:r>
+          </w:p>
+        </w:tc>
+      </w:tr>
+      <w:tr>
+        <w:tc>
+          <w:tcPr>
+            <w:tcW w:w="0" w:type="auto"/>
+            <w:tcMar>
+              <w:top w:w="75" w:type="dxa"/>
+              <w:left w:w="135" w:type="dxa"/>
+              <w:bottom w:w="75" w:type="dxa"/>
+              <w:right w:w="135" w:type="dxa"/>
+            </w:tcMar>
+            <w:hideMark/>
+          </w:tcPr>
+          <w:p>
+            <w:pPr>
+              <w:spacing w:after="160"/>
+            </w:pPr>
+            <w:r>
+              <w:t>2</w:t>
+            </w:r>
+          </w:p>
+        </w:tc>
+        <w:tc>
+          <w:tcPr>
+            <w:tcW w:w="0" w:type="auto"/>
+            <w:tcMar>
+              <w:top w:w="75" w:type="dxa"/>
+              <w:left w:w="135" w:type="dxa"/>
+              <w:bottom w:w="75" w:type="dxa"/>
+              <w:right w:w="135" w:type="dxa"/>
+            </w:tcMar>
+            <w:hideMark/>
+          </w:tcPr>
+          <w:p>
+            <w:pPr>
+              <w:spacing w:after="160"/>
+            </w:pPr>
+            <w:proofErr w:type="spellStart"/>
+            <w:r>
+              <w:t>Enkripsi</w:t>
+            </w:r>
+            <w:proofErr w:type="spellEnd"/>
+            <w:r>
+              <w:t xml:space="preserve"> </w:t>
+            </w:r>
+            <w:proofErr w:type="spellStart"/>
+            <w:r>
+              <w:t>sedang</w:t>
+            </w:r>
+            <w:proofErr w:type="spellEnd"/>
+            <w:r>
+              <w:t xml:space="preserve"> </w:t>
+            </w:r>
+            <w:proofErr w:type="spellStart"/>
+            <w:r>
+              <w:t>berjalan</w:t>
+            </w:r>
+            <w:proofErr w:type="spellEnd"/>
+          </w:p>
+        </w:tc>
+      </w:tr>
+      <w:tr>
+        <w:tc>
+          <w:tcPr>
+            <w:tcW w:w="0" w:type="auto"/>
+            <w:tcMar>
+              <w:top w:w="75" w:type="dxa"/>
+              <w:left w:w="135" w:type="dxa"/>
+              <w:bottom w:w="75" w:type="dxa"/>
+              <w:right w:w="135" w:type="dxa"/>
+            </w:tcMar>
+            <w:hideMark/>
+          </w:tcPr>
+          <w:p>
+            <w:pPr>
+              <w:spacing w:after="160"/>
+            </w:pPr>
+            <w:r>
+              <w:t>3</w:t>
+            </w:r>
+          </w:p>
+        </w:tc>
+        <w:tc>
+          <w:tcPr>
+            <w:tcW w:w="0" w:type="auto"/>
+            <w:tcMar>
+              <w:top w:w="75" w:type="dxa"/>
+              <w:left w:w="135" w:type="dxa"/>
+              <w:bottom w:w="75" w:type="dxa"/>
+              <w:right w:w="135" w:type="dxa"/>
+            </w:tcMar>
+            <w:hideMark/>
+          </w:tcPr>
+          <w:p>
+            <w:pPr>
+              <w:spacing w:after="160"/>
+            </w:pPr>
+            <w:proofErr w:type="spellStart"/>
+            <w:r>
+              <w:rPr>
+                <w:b/>
+                <w:bCs/>
+              </w:rPr>
+              <w:t>Selesai</w:t>
+            </w:r>
+            <w:proofErr w:type="spellEnd"/>
+            <w:r>
+              <w:rPr>
+                <w:b/>
+                <w:bCs/>
+              </w:rPr>
+              <w:t xml:space="preserve"> — database + log </w:t>
+            </w:r>
+            <w:proofErr w:type="spellStart"/>
+            <w:r>
+              <w:rPr>
+                <w:b/>
+                <w:bCs/>
+              </w:rPr>
+              <w:t>terenkripsi</w:t>
+            </w:r>
+            <w:proofErr w:type="spellEnd"/>
+          </w:p>
+        </w:tc>
+      </w:tr>
+      <w:tr>
+        <w:tc>
+          <w:tcPr>
+            <w:tcW w:w="0" w:type="auto"/>
+            <w:tcMar>
+              <w:top w:w="75" w:type="dxa"/>
+              <w:left w:w="135" w:type="dxa"/>
+              <w:bottom w:w="75" w:type="dxa"/>
+              <w:right w:w="135" w:type="dxa"/>
+            </w:tcMar>
+            <w:hideMark/>
+          </w:tcPr>
+          <w:p>
+            <w:pPr>
+              <w:spacing w:after="160"/>
+            </w:pPr>
+            <w:r>
+              <w:t>5</w:t>
+            </w:r>
+          </w:p>
+        </w:tc>
+        <w:tc>
+          <w:tcPr>
+            <w:tcW w:w="0" w:type="auto"/>
+            <w:tcMar>
+              <w:top w:w="75" w:type="dxa"/>
+              <w:left w:w="135" w:type="dxa"/>
+              <w:bottom w:w="75" w:type="dxa"/>
+              <w:right w:w="135" w:type="dxa"/>
+            </w:tcMar>
+            <w:hideMark/>
+          </w:tcPr>
+          <w:p>
+            <w:pPr>
+              <w:spacing w:after="160"/>
+            </w:pPr>
+            <w:proofErr w:type="spellStart"/>
+            <w:r>
+              <w:t>Dekripsi</w:t>
+            </w:r>
+            <w:proofErr w:type="spellEnd"/>
+            <w:r>
+              <w:t xml:space="preserve"> </w:t>
+            </w:r>
+            <w:proofErr w:type="spellStart"/>
+            <w:r>
+              <w:t>sedang</w:t>
+            </w:r>
+            <w:proofErr w:type="spellEnd"/>
+            <w:r>
+              <w:t xml:space="preserve"> </w:t>
+            </w:r>
+            <w:proofErr w:type="spellStart"/>
+            <w:r>
+              <w:t>berjalan</w:t>
+            </w:r>
+            <w:proofErr w:type="spellEnd"/>
+          </w:p>
+        </w:tc>
+      </w:tr>
+    </w:tbl>
+    <w:p>
+      <w:pPr>
+        <w:spacing w:after="160"/>
+      </w:pPr>
+      <w:proofErr w:type="spellStart"/>
+      <w:r>
+        <w:t>Jangan</w:t>
+      </w:r>
+      <w:proofErr w:type="spellEnd"/>
+      <w:r>
+        <w:t xml:space="preserve"> detach / backup / </w:t>
+      </w:r>
+      <w:proofErr w:type="spellStart"/>
+      <w:r>
+        <w:t>ubah</w:t>
+      </w:r>
+      <w:proofErr w:type="spellEnd"/>
+      <w:r>
+        <w:t xml:space="preserve"> filegroup </w:t>
+      </w:r>
+      <w:proofErr w:type="spellStart"/>
+      <w:r>
+        <w:t>selama</w:t>
+      </w:r>
+      <w:proofErr w:type="spellEnd"/>
+      <w:r>
+        <w:t xml:space="preserve"> state = 2.</w:t>
+      </w:r>
+    </w:p>
+    <w:p>
+      <w:pPr>
+        <w:spacing w:after="160"/>
+      </w:pPr>
+      <w:r>
+        <w:t xml:space="preserve">Beban server </w:t>
+      </w:r>
+      <w:proofErr w:type="spellStart"/>
+      <w:r>
+        <w:t>tinggi</w:t>
+      </w:r>
+      <w:proofErr w:type="spellEnd"/>
+      <w:r>
+        <w:t xml:space="preserve"> (SQL Server 2019+):</w:t>
+      </w:r>
+    </w:p>
+    <w:p>
+      <w:pPr>
+        <w:spacing w:after="160"/>
+      </w:pPr>
+      <w:proofErr w:type="spellStart"/>
+      <w:r>
+        <w:t>sqlcmd</w:t>
+      </w:r>
+      <w:proofErr w:type="spellEnd"/>
+      <w:r>
+        <w:t xml:space="preserve"> -S localhost -E -Q "ALTER DATABASE StackOverflow2013 SET ENCRYPTION SUSPEND;"</w:t>
+      </w:r>
+    </w:p>
+    <w:p>
+      <w:pPr>
+        <w:spacing w:after="160"/>
+      </w:pPr>
+      <w:proofErr w:type="spellStart"/>
+      <w:r>
+        <w:t>sqlcmd</w:t>
+      </w:r>
+      <w:proofErr w:type="spellEnd"/>
+      <w:r>
+        <w:t xml:space="preserve"> -S localhost -E -Q "ALTER DATABASE StackOverflow2013 SET ENCRYPTION RESUME;"</w:t>
+      </w:r>
+    </w:p>
+    <w:p>
+      <w:pPr>
+        <w:spacing w:after="160"/>
+      </w:pPr>
+      <w:r>
+        <w:pict w14:anchorId="318B9D14">
+          <v:rect id="_x0000_i1032" style="width:0;height:1.5pt" o:hralign="center" o:hrstd="t" o:hr="t" fillcolor="#a0a0a0" stroked="f"/>
+        </w:pict>
+      </w:r>
+    </w:p>
+    <w:p>
+      <w:pPr>
+        <w:spacing w:after="160"/>
+        <w:rPr>
+          <w:b/>
+          <w:bCs/>
+        </w:rPr>
+      </w:pPr>
+      <w:r>
+        <w:rPr>
+          <w:b/>
+          <w:bCs/>
+        </w:rPr>
+        <w:t xml:space="preserve">8. </w:t>
+      </w:r>
+      <w:proofErr w:type="spellStart"/>
+      <w:r>
+        <w:rPr>
+          <w:b/>
+          <w:bCs/>
+        </w:rPr>
+        <w:t>Pengujian</w:t>
+      </w:r>
+      <w:proofErr w:type="spellEnd"/>
+      <w:r>
+        <w:rPr>
+          <w:b/>
+          <w:bCs/>
+        </w:rPr>
+        <w:t xml:space="preserve"> TDE</w:t>
+      </w:r>
+    </w:p>
+    <w:p>
+      <w:pPr>
+        <w:spacing w:after="160"/>
+      </w:pPr>
+      <w:proofErr w:type="spellStart"/>
+      <w:r>
+        <w:t>Lakukan</w:t>
+      </w:r>
+      <w:proofErr w:type="spellEnd"/>
+      <w:r>
+        <w:t> </w:t>
+      </w:r>
+      <w:proofErr w:type="spellStart"/>
+      <w:r>
+        <w:rPr>
+          <w:b/>
+          <w:bCs/>
+        </w:rPr>
+        <w:t>setelah</w:t>
+      </w:r>
+      <w:proofErr w:type="spellEnd"/>
+      <w:r>
+        <w:t> </w:t>
+      </w:r>
+      <w:proofErr w:type="spellStart"/>
+      <w:r>
+        <w:t>encryption_state</w:t>
+      </w:r>
+      <w:proofErr w:type="spellEnd"/>
+      <w:r>
+        <w:t xml:space="preserve"> = 3.</w:t>
+      </w:r>
+    </w:p>
+    <w:p>
+      <w:pPr>
+        <w:spacing w:after="160"/>
+      </w:pPr>
+      <w:r>
+        <w:rPr>
+          <w:b/>
+          <w:bCs/>
+        </w:rPr>
+        <w:t xml:space="preserve">A. </w:t>
+      </w:r>
+      <w:proofErr w:type="spellStart"/>
+      <w:r>
+        <w:rPr>
+          <w:b/>
+          <w:bCs/>
+        </w:rPr>
+        <w:t>Enkripsi</w:t>
+      </w:r>
+      <w:proofErr w:type="spellEnd"/>
+      <w:r>
+        <w:rPr>
+          <w:b/>
+          <w:bCs/>
+        </w:rPr>
+        <w:t xml:space="preserve"> </w:t>
+      </w:r>
+      <w:proofErr w:type="spellStart"/>
+      <w:r>
+        <w:rPr>
+          <w:b/>
+          <w:bCs/>
+        </w:rPr>
+        <w:t>aktif</w:t>
+      </w:r>
+      <w:proofErr w:type="spellEnd"/>
+      <w:r>
+        <w:rPr>
+          <w:b/>
+          <w:bCs/>
+        </w:rPr>
+        <w:t xml:space="preserve"> di </w:t>
+      </w:r>
+      <w:proofErr w:type="spellStart"/>
+      <w:r>
+        <w:rPr>
+          <w:b/>
+          <w:bCs/>
+        </w:rPr>
+        <w:t>katalog</w:t>
+      </w:r>
+      <w:proofErr w:type="spellEnd"/>
+    </w:p>
+    <w:p>
+      <w:pPr>
+        <w:spacing w:after="160"/>
+      </w:pPr>
+      <w:proofErr w:type="spellStart"/>
+      <w:r>
+        <w:t>sqlcmd</w:t>
+      </w:r>
+      <w:proofErr w:type="spellEnd"/>
+      <w:r>
+        <w:t xml:space="preserve"> -S localhost -E -Q "SELECT name, </w:t>
+      </w:r>
+      <w:proofErr w:type="spellStart"/>
+      <w:r>
+        <w:t>is_encrypted</w:t>
+      </w:r>
+      <w:proofErr w:type="spellEnd"/>
+      <w:r>
+        <w:t xml:space="preserve"> FROM </w:t>
+      </w:r>
+      <w:proofErr w:type="spellStart"/>
+      <w:proofErr w:type="gramStart"/>
+      <w:r>
+        <w:t>sys.databases</w:t>
+      </w:r>
+      <w:proofErr w:type="spellEnd"/>
+      <w:proofErr w:type="gramEnd"/>
+      <w:r>
+        <w:t xml:space="preserve"> WHERE name = N'StackOverflow2013';"</w:t>
+      </w:r>
+    </w:p>
+    <w:p>
+      <w:pPr>
+        <w:spacing w:after="160"/>
+      </w:pPr>
+      <w:r>
+        <w:t>Harus </w:t>
+      </w:r>
+      <w:proofErr w:type="spellStart"/>
+      <w:r>
+        <w:t>is_encrypted</w:t>
+      </w:r>
+      <w:proofErr w:type="spellEnd"/>
+      <w:r>
+        <w:t xml:space="preserve"> = 1.</w:t>
+      </w:r>
+    </w:p>
+    <w:p>
+      <w:pPr>
+        <w:spacing w:after="160"/>
+      </w:pPr>
+      <w:r>
+        <w:rPr>
+          <w:b/>
+          <w:bCs/>
+        </w:rPr>
+        <w:t xml:space="preserve">B. </w:t>
+      </w:r>
+      <w:proofErr w:type="spellStart"/>
+      <w:r>
+        <w:rPr>
+          <w:b/>
+          <w:bCs/>
+        </w:rPr>
+        <w:t>Aplikasi</w:t>
+      </w:r>
+      <w:proofErr w:type="spellEnd"/>
+      <w:r>
+        <w:rPr>
+          <w:b/>
+          <w:bCs/>
+        </w:rPr>
+        <w:t xml:space="preserve"> </w:t>
+      </w:r>
+      <w:proofErr w:type="spellStart"/>
+      <w:r>
+        <w:rPr>
+          <w:b/>
+          <w:bCs/>
+        </w:rPr>
+        <w:t>masih</w:t>
+      </w:r>
+      <w:proofErr w:type="spellEnd"/>
+      <w:r>
+        <w:rPr>
+          <w:b/>
+          <w:bCs/>
+        </w:rPr>
+        <w:t xml:space="preserve"> </w:t>
+      </w:r>
+      <w:proofErr w:type="spellStart"/>
+      <w:r>
+        <w:rPr>
+          <w:b/>
+          <w:bCs/>
+        </w:rPr>
+        <w:t>transparan</w:t>
+      </w:r>
+      <w:proofErr w:type="spellEnd"/>
+      <w:r>
+        <w:rPr>
+          <w:b/>
+          <w:bCs/>
+        </w:rPr>
+        <w:t xml:space="preserve"> (data </w:t>
+      </w:r>
+      <w:proofErr w:type="spellStart"/>
+      <w:r>
+        <w:rPr>
+          <w:b/>
+          <w:bCs/>
+        </w:rPr>
+        <w:t>tetap</w:t>
+      </w:r>
+      <w:proofErr w:type="spellEnd"/>
+      <w:r>
+        <w:rPr>
+          <w:b/>
+          <w:bCs/>
+        </w:rPr>
+        <w:t xml:space="preserve"> </w:t>
+      </w:r>
+      <w:proofErr w:type="spellStart"/>
+      <w:r>
+        <w:rPr>
+          <w:b/>
+          <w:bCs/>
+        </w:rPr>
+        <w:t>terbaca</w:t>
+      </w:r>
+      <w:proofErr w:type="spellEnd"/>
+      <w:r>
+        <w:rPr>
+          <w:b/>
+          <w:bCs/>
+        </w:rPr>
+        <w:t>)</w:t>
+      </w:r>
+    </w:p>
+    <w:p>
+      <w:pPr>
+        <w:spacing w:after="160"/>
+      </w:pPr>
+      <w:proofErr w:type="spellStart"/>
+      <w:r>
+        <w:t>sqlcmd</w:t>
+      </w:r>
+      <w:proofErr w:type="spellEnd"/>
+      <w:r>
+        <w:t xml:space="preserve"> -S localhost -E -d StackOverflow2013 -Q "SELECT TOP 5 Id, DisplayName FROM </w:t>
+      </w:r>
+      <w:proofErr w:type="spellStart"/>
+      <w:proofErr w:type="gramStart"/>
+      <w:r>
+        <w:t>dbo.Users</w:t>
+      </w:r>
+      <w:proofErr w:type="spellEnd"/>
+      <w:proofErr w:type="gramEnd"/>
+      <w:r>
+        <w:t>;"</w:t>
+      </w:r>
+    </w:p>
+    <w:p>
+      <w:pPr>
+        <w:spacing w:after="160"/>
+      </w:pPr>
+      <w:r>
+        <w:t xml:space="preserve">Hasil </w:t>
+      </w:r>
+      <w:proofErr w:type="spellStart"/>
+      <w:r>
+        <w:t>harus</w:t>
+      </w:r>
+      <w:proofErr w:type="spellEnd"/>
+      <w:r>
+        <w:t xml:space="preserve"> </w:t>
+      </w:r>
+      <w:proofErr w:type="spellStart"/>
+      <w:r>
+        <w:t>sama</w:t>
+      </w:r>
+      <w:proofErr w:type="spellEnd"/>
+      <w:r>
+        <w:t xml:space="preserve"> </w:t>
+      </w:r>
+      <w:proofErr w:type="spellStart"/>
+      <w:r>
+        <w:t>seperti</w:t>
+      </w:r>
+      <w:proofErr w:type="spellEnd"/>
+      <w:r>
+        <w:t xml:space="preserve"> </w:t>
+      </w:r>
+      <w:proofErr w:type="spellStart"/>
+      <w:r>
+        <w:t>langkah</w:t>
+      </w:r>
+      <w:proofErr w:type="spellEnd"/>
+      <w:r>
+        <w:t xml:space="preserve"> 1. TDE </w:t>
+      </w:r>
+      <w:proofErr w:type="spellStart"/>
+      <w:r>
+        <w:t>tidak</w:t>
+      </w:r>
+      <w:proofErr w:type="spellEnd"/>
+      <w:r>
+        <w:t xml:space="preserve"> </w:t>
+      </w:r>
+      <w:proofErr w:type="spellStart"/>
+      <w:r>
+        <w:t>mengubah</w:t>
+      </w:r>
+      <w:proofErr w:type="spellEnd"/>
+      <w:r>
+        <w:t xml:space="preserve"> query.</w:t>
+      </w:r>
+    </w:p>
+    <w:p>
+      <w:r>
+        <w:br w:type="page"/>
+      </w:r>
+    </w:p>
+    <w:p>
+      <w:pPr>
+        <w:spacing w:after="160"/>
+      </w:pPr>
+      <w:r>
+        <w:rPr>
+          <w:b/>
+          <w:bCs/>
+        </w:rPr>
+        <w:lastRenderedPageBreak/>
+        <w:t xml:space="preserve">C. </w:t>
+      </w:r>
+      <w:proofErr w:type="spellStart"/>
+      <w:r>
+        <w:rPr>
+          <w:b/>
+          <w:bCs/>
+        </w:rPr>
+        <w:t>Sertifikat</w:t>
+      </w:r>
+      <w:proofErr w:type="spellEnd"/>
+      <w:r>
+        <w:rPr>
+          <w:b/>
+          <w:bCs/>
+        </w:rPr>
+        <w:t xml:space="preserve"> </w:t>
+      </w:r>
+      <w:proofErr w:type="spellStart"/>
+      <w:r>
+        <w:rPr>
+          <w:b/>
+          <w:bCs/>
+        </w:rPr>
+        <w:t>sudah</w:t>
+      </w:r>
+      <w:proofErr w:type="spellEnd"/>
+      <w:r>
+        <w:rPr>
+          <w:b/>
+          <w:bCs/>
+        </w:rPr>
+        <w:t xml:space="preserve"> di-backup</w:t>
+      </w:r>
+    </w:p>
+    <w:p>
+      <w:pPr>
+        <w:spacing w:after="160"/>
+      </w:pPr>
+      <w:proofErr w:type="spellStart"/>
+      <w:r>
+        <w:t>sqlcmd</w:t>
+      </w:r>
+      <w:proofErr w:type="spellEnd"/>
+      <w:r>
+        <w:t xml:space="preserve"> -S localhost -E -Q "SELECT c.name, </w:t>
+      </w:r>
+      <w:proofErr w:type="spellStart"/>
+      <w:r>
+        <w:t>c.pvt_key_last_backup_date</w:t>
+      </w:r>
+      <w:proofErr w:type="spellEnd"/>
+      <w:r>
+        <w:t>, DB_</w:t>
+      </w:r>
+      <w:proofErr w:type="gramStart"/>
+      <w:r>
+        <w:t>NAME(</w:t>
+      </w:r>
+      <w:proofErr w:type="spellStart"/>
+      <w:r>
+        <w:t>dek.database</w:t>
+      </w:r>
+      <w:proofErr w:type="gramEnd"/>
+      <w:r>
+        <w:t>_id</w:t>
+      </w:r>
+      <w:proofErr w:type="spellEnd"/>
+      <w:r>
+        <w:t xml:space="preserve">) AS </w:t>
+      </w:r>
+      <w:proofErr w:type="spellStart"/>
+      <w:r>
+        <w:t>db</w:t>
+      </w:r>
+      <w:proofErr w:type="spellEnd"/>
+      <w:r>
+        <w:t xml:space="preserve"> FROM </w:t>
+      </w:r>
+      <w:proofErr w:type="spellStart"/>
+      <w:proofErr w:type="gramStart"/>
+      <w:r>
+        <w:t>sys.certificates</w:t>
+      </w:r>
+      <w:proofErr w:type="spellEnd"/>
+      <w:proofErr w:type="gramEnd"/>
+      <w:r>
+        <w:t xml:space="preserve"> c INNER JOIN </w:t>
+      </w:r>
+      <w:proofErr w:type="spellStart"/>
+      <w:r>
+        <w:t>sys.dm_database_encryption_keys</w:t>
+      </w:r>
+      <w:proofErr w:type="spellEnd"/>
+      <w:r>
+        <w:t xml:space="preserve"> </w:t>
+      </w:r>
+      <w:proofErr w:type="spellStart"/>
+      <w:r>
+        <w:t>dek</w:t>
+      </w:r>
+      <w:proofErr w:type="spellEnd"/>
+      <w:r>
+        <w:t xml:space="preserve"> ON </w:t>
+      </w:r>
+      <w:proofErr w:type="spellStart"/>
+      <w:proofErr w:type="gramStart"/>
+      <w:r>
+        <w:t>c.thumbprint</w:t>
+      </w:r>
+      <w:proofErr w:type="spellEnd"/>
+      <w:proofErr w:type="gramEnd"/>
+      <w:r>
+        <w:t xml:space="preserve"> = </w:t>
+      </w:r>
+      <w:proofErr w:type="spellStart"/>
+      <w:proofErr w:type="gramStart"/>
+      <w:r>
+        <w:t>dek.encryptor</w:t>
+      </w:r>
+      <w:proofErr w:type="gramEnd"/>
+      <w:r>
+        <w:t>_thumbprint</w:t>
+      </w:r>
+      <w:proofErr w:type="spellEnd"/>
+      <w:r>
+        <w:t>;"</w:t>
+      </w:r>
+    </w:p>
+    <w:p>
+      <w:pPr>
+        <w:spacing w:after="160"/>
+      </w:pPr>
+      <w:proofErr w:type="spellStart"/>
+      <w:r>
+        <w:t>pvt_key_last_backup_date</w:t>
+      </w:r>
+      <w:proofErr w:type="spellEnd"/>
+      <w:r>
+        <w:t> </w:t>
+      </w:r>
+      <w:proofErr w:type="spellStart"/>
+      <w:r>
+        <w:rPr>
+          <w:b/>
+          <w:bCs/>
+        </w:rPr>
+        <w:t>tidak</w:t>
+      </w:r>
+      <w:proofErr w:type="spellEnd"/>
+      <w:r>
+        <w:rPr>
+          <w:b/>
+          <w:bCs/>
+        </w:rPr>
+        <w:t xml:space="preserve"> </w:t>
+      </w:r>
+      <w:proofErr w:type="spellStart"/>
+      <w:r>
+        <w:rPr>
+          <w:b/>
+          <w:bCs/>
+        </w:rPr>
+        <w:t>boleh</w:t>
+      </w:r>
+      <w:proofErr w:type="spellEnd"/>
+      <w:r>
+        <w:rPr>
+          <w:b/>
+          <w:bCs/>
+        </w:rPr>
+        <w:t xml:space="preserve"> NULL</w:t>
+      </w:r>
+      <w:r>
+        <w:t>.</w:t>
+      </w:r>
+    </w:p>
+    <w:p>
+      <w:pPr>
+        <w:spacing w:after="160"/>
+      </w:pPr>
+      <w:r>
+        <w:rPr>
+          <w:b/>
+          <w:bCs/>
+        </w:rPr>
+        <w:t xml:space="preserve">D. Backup database </w:t>
+      </w:r>
+      <w:proofErr w:type="spellStart"/>
+      <w:r>
+        <w:rPr>
+          <w:b/>
+          <w:bCs/>
+        </w:rPr>
+        <w:t>terenkripsi</w:t>
+      </w:r>
+      <w:proofErr w:type="spellEnd"/>
+      <w:r>
+        <w:rPr>
+          <w:b/>
+          <w:bCs/>
+        </w:rPr>
+        <w:t xml:space="preserve"> (</w:t>
+      </w:r>
+      <w:proofErr w:type="spellStart"/>
+      <w:r>
+        <w:rPr>
+          <w:b/>
+          <w:bCs/>
+        </w:rPr>
+        <w:t>opsional</w:t>
+      </w:r>
+      <w:proofErr w:type="spellEnd"/>
+      <w:r>
+        <w:rPr>
+          <w:b/>
+          <w:bCs/>
+        </w:rPr>
+        <w:t xml:space="preserve">, </w:t>
+      </w:r>
+      <w:proofErr w:type="spellStart"/>
+      <w:r>
+        <w:rPr>
+          <w:b/>
+          <w:bCs/>
+        </w:rPr>
+        <w:t>butuh</w:t>
+      </w:r>
+      <w:proofErr w:type="spellEnd"/>
+      <w:r>
+        <w:rPr>
+          <w:b/>
+          <w:bCs/>
+        </w:rPr>
+        <w:t xml:space="preserve"> </w:t>
+      </w:r>
+      <w:proofErr w:type="spellStart"/>
+      <w:r>
+        <w:rPr>
+          <w:b/>
+          <w:bCs/>
+        </w:rPr>
+        <w:t>ruang</w:t>
+      </w:r>
+      <w:proofErr w:type="spellEnd"/>
+      <w:r>
+        <w:rPr>
+          <w:b/>
+          <w:bCs/>
+        </w:rPr>
+        <w:t xml:space="preserve"> disk)</w:t>
+      </w:r>
+    </w:p>
+    <w:p>
+      <w:pPr>
+        <w:spacing w:after="160"/>
+      </w:pPr>
+      <w:r>
+        <w:t xml:space="preserve">Sisa E: ~41 GB; backup </w:t>
+      </w:r>
+      <w:proofErr w:type="spellStart"/>
+      <w:r>
+        <w:t>penuh</w:t>
+      </w:r>
+      <w:proofErr w:type="spellEnd"/>
+      <w:r>
+        <w:t xml:space="preserve"> ~55 GB </w:t>
+      </w:r>
+      <w:proofErr w:type="spellStart"/>
+      <w:r>
+        <w:t>mungkin</w:t>
+      </w:r>
+      <w:proofErr w:type="spellEnd"/>
+      <w:r>
+        <w:t> </w:t>
+      </w:r>
+      <w:proofErr w:type="spellStart"/>
+      <w:r>
+        <w:rPr>
+          <w:b/>
+          <w:bCs/>
+        </w:rPr>
+        <w:t>tidak</w:t>
+      </w:r>
+      <w:proofErr w:type="spellEnd"/>
+      <w:r>
+        <w:rPr>
+          <w:b/>
+          <w:bCs/>
+        </w:rPr>
+        <w:t xml:space="preserve"> </w:t>
+      </w:r>
+      <w:proofErr w:type="spellStart"/>
+      <w:r>
+        <w:rPr>
+          <w:b/>
+          <w:bCs/>
+        </w:rPr>
+        <w:t>muat</w:t>
+      </w:r>
+      <w:proofErr w:type="spellEnd"/>
+      <w:r>
+        <w:t xml:space="preserve"> di </w:t>
+      </w:r>
+      <w:proofErr w:type="gramStart"/>
+      <w:r>
+        <w:t>E:.</w:t>
+      </w:r>
+      <w:proofErr w:type="gramEnd"/>
+      <w:r>
+        <w:t xml:space="preserve"> Pakai drive lain </w:t>
+      </w:r>
+      <w:proofErr w:type="spellStart"/>
+      <w:r>
+        <w:t>jika</w:t>
+      </w:r>
+      <w:proofErr w:type="spellEnd"/>
+      <w:r>
+        <w:t xml:space="preserve"> </w:t>
+      </w:r>
+      <w:proofErr w:type="spellStart"/>
+      <w:r>
+        <w:t>ada</w:t>
+      </w:r>
+      <w:proofErr w:type="spellEnd"/>
+      <w:r>
+        <w:t>:</w:t>
+      </w:r>
+    </w:p>
+    <w:p>
+      <w:pPr>
+        <w:spacing w:after="160"/>
+      </w:pPr>
+      <w:proofErr w:type="spellStart"/>
+      <w:r>
+        <w:t>sqlcmd</w:t>
+      </w:r>
+      <w:proofErr w:type="spellEnd"/>
+      <w:r>
+        <w:t xml:space="preserve"> -S localhost -E -Q "BACKUP DATABASE StackOverflow2013 TO DISK = 'D:\Backup\StackOverflow2013_TDE.bak' WITH COPY_ONLY, COMPRESSION, STATS = 10;"</w:t>
+      </w:r>
+    </w:p>
+    <w:p>
+      <w:pPr>
+        <w:spacing w:after="160"/>
+      </w:pPr>
+      <w:r>
+        <w:rPr>
+          <w:b/>
+          <w:bCs/>
+        </w:rPr>
+        <w:t xml:space="preserve">E. Uji </w:t>
+      </w:r>
+      <w:proofErr w:type="spellStart"/>
+      <w:r>
+        <w:rPr>
+          <w:b/>
+          <w:bCs/>
+        </w:rPr>
+        <w:t>perlindungan</w:t>
+      </w:r>
+      <w:proofErr w:type="spellEnd"/>
+      <w:r>
+        <w:rPr>
+          <w:b/>
+          <w:bCs/>
+        </w:rPr>
+        <w:t xml:space="preserve"> at rest (</w:t>
+      </w:r>
+      <w:proofErr w:type="spellStart"/>
+      <w:r>
+        <w:rPr>
+          <w:b/>
+          <w:bCs/>
+        </w:rPr>
+        <w:t>tes</w:t>
+      </w:r>
+      <w:proofErr w:type="spellEnd"/>
+      <w:r>
+        <w:rPr>
+          <w:b/>
+          <w:bCs/>
+        </w:rPr>
+        <w:t xml:space="preserve"> yang paling </w:t>
+      </w:r>
+      <w:proofErr w:type="spellStart"/>
+      <w:r>
+        <w:rPr>
+          <w:b/>
+          <w:bCs/>
+        </w:rPr>
+        <w:t>penting</w:t>
+      </w:r>
+      <w:proofErr w:type="spellEnd"/>
+      <w:r>
+        <w:rPr>
+          <w:b/>
+          <w:bCs/>
+        </w:rPr>
+        <w:t>)</w:t>
+      </w:r>
+    </w:p>
+    <w:p>
+      <w:pPr>
+        <w:spacing w:after="160"/>
+      </w:pPr>
+      <w:r>
+        <w:t>Di </w:t>
+      </w:r>
+      <w:r>
+        <w:rPr>
+          <w:b/>
+          <w:bCs/>
+        </w:rPr>
+        <w:t>instance SQL Server lain</w:t>
+      </w:r>
+      <w:r>
+        <w:t> (</w:t>
+      </w:r>
+      <w:proofErr w:type="spellStart"/>
+      <w:r>
+        <w:t>atau</w:t>
+      </w:r>
+      <w:proofErr w:type="spellEnd"/>
+      <w:r>
+        <w:t xml:space="preserve"> </w:t>
+      </w:r>
+      <w:proofErr w:type="spellStart"/>
+      <w:r>
+        <w:t>instal</w:t>
+      </w:r>
+      <w:proofErr w:type="spellEnd"/>
+      <w:r>
+        <w:t xml:space="preserve"> instance </w:t>
+      </w:r>
+      <w:proofErr w:type="spellStart"/>
+      <w:r>
+        <w:t>kedua</w:t>
+      </w:r>
+      <w:proofErr w:type="spellEnd"/>
+      <w:r>
+        <w:t>), </w:t>
+      </w:r>
+      <w:proofErr w:type="spellStart"/>
+      <w:r>
+        <w:rPr>
+          <w:b/>
+          <w:bCs/>
+        </w:rPr>
+        <w:t>jangan</w:t>
+      </w:r>
+      <w:proofErr w:type="spellEnd"/>
+      <w:r>
+        <w:t xml:space="preserve"> import </w:t>
+      </w:r>
+      <w:proofErr w:type="spellStart"/>
+      <w:r>
+        <w:t>sertifikat</w:t>
+      </w:r>
+      <w:proofErr w:type="spellEnd"/>
+      <w:r>
+        <w:t xml:space="preserve">, </w:t>
+      </w:r>
+      <w:proofErr w:type="spellStart"/>
+      <w:r>
+        <w:t>lalu</w:t>
+      </w:r>
+      <w:proofErr w:type="spellEnd"/>
+      <w:r>
+        <w:t xml:space="preserve"> </w:t>
+      </w:r>
+      <w:proofErr w:type="spellStart"/>
+      <w:r>
+        <w:t>coba</w:t>
+      </w:r>
+      <w:proofErr w:type="spellEnd"/>
+      <w:r>
+        <w:t xml:space="preserve"> attach file yang </w:t>
+      </w:r>
+      <w:proofErr w:type="spellStart"/>
+      <w:r>
+        <w:t>sama</w:t>
+      </w:r>
+      <w:proofErr w:type="spellEnd"/>
+      <w:r>
+        <w:t xml:space="preserve">. Attach </w:t>
+      </w:r>
+      <w:proofErr w:type="spellStart"/>
+      <w:r>
+        <w:t>harus</w:t>
+      </w:r>
+      <w:proofErr w:type="spellEnd"/>
+      <w:r>
+        <w:t> </w:t>
+      </w:r>
+      <w:proofErr w:type="spellStart"/>
+      <w:r>
+        <w:rPr>
+          <w:b/>
+          <w:bCs/>
+        </w:rPr>
+        <w:t>gagal</w:t>
+      </w:r>
+      <w:proofErr w:type="spellEnd"/>
+      <w:r>
+        <w:t> (</w:t>
+      </w:r>
+      <w:proofErr w:type="spellStart"/>
+      <w:r>
+        <w:t>tidak</w:t>
+      </w:r>
+      <w:proofErr w:type="spellEnd"/>
+      <w:r>
+        <w:t xml:space="preserve"> </w:t>
+      </w:r>
+      <w:proofErr w:type="spellStart"/>
+      <w:r>
+        <w:t>bisa</w:t>
+      </w:r>
+      <w:proofErr w:type="spellEnd"/>
+      <w:r>
+        <w:t xml:space="preserve"> </w:t>
+      </w:r>
+      <w:proofErr w:type="spellStart"/>
+      <w:r>
+        <w:t>buka</w:t>
+      </w:r>
+      <w:proofErr w:type="spellEnd"/>
+      <w:r>
+        <w:t xml:space="preserve"> DEK).</w:t>
+      </w:r>
+    </w:p>
+    <w:p>
+      <w:pPr>
+        <w:spacing w:after="160"/>
+      </w:pPr>
+      <w:r>
+        <w:t xml:space="preserve">Di instance </w:t>
+      </w:r>
+      <w:proofErr w:type="spellStart"/>
+      <w:r>
+        <w:t>tujuan</w:t>
+      </w:r>
+      <w:proofErr w:type="spellEnd"/>
+      <w:r>
+        <w:t xml:space="preserve"> yang </w:t>
+      </w:r>
+      <w:proofErr w:type="spellStart"/>
+      <w:r>
+        <w:rPr>
+          <w:b/>
+          <w:bCs/>
+        </w:rPr>
+        <w:t>benar</w:t>
+      </w:r>
+      <w:proofErr w:type="spellEnd"/>
+      <w:r>
+        <w:t> (</w:t>
+      </w:r>
+      <w:proofErr w:type="spellStart"/>
+      <w:r>
+        <w:t>setelah</w:t>
+      </w:r>
+      <w:proofErr w:type="spellEnd"/>
+      <w:r>
+        <w:t xml:space="preserve"> </w:t>
+      </w:r>
+      <w:proofErr w:type="spellStart"/>
+      <w:r>
+        <w:t>tes</w:t>
+      </w:r>
+      <w:proofErr w:type="spellEnd"/>
+      <w:r>
+        <w:t xml:space="preserve"> </w:t>
+      </w:r>
+      <w:proofErr w:type="spellStart"/>
+      <w:r>
+        <w:t>gagal</w:t>
+      </w:r>
+      <w:proofErr w:type="spellEnd"/>
+      <w:r>
+        <w:t xml:space="preserve">), import </w:t>
+      </w:r>
+      <w:proofErr w:type="spellStart"/>
+      <w:r>
+        <w:t>sertifikat</w:t>
+      </w:r>
+      <w:proofErr w:type="spellEnd"/>
+      <w:r>
+        <w:t xml:space="preserve"> </w:t>
+      </w:r>
+      <w:proofErr w:type="spellStart"/>
+      <w:r>
+        <w:t>dulu</w:t>
+      </w:r>
+      <w:proofErr w:type="spellEnd"/>
+      <w:r>
+        <w:t xml:space="preserve">, </w:t>
+      </w:r>
+      <w:proofErr w:type="spellStart"/>
+      <w:r>
+        <w:t>baru</w:t>
+      </w:r>
+      <w:proofErr w:type="spellEnd"/>
+      <w:r>
+        <w:t xml:space="preserve"> attach:</w:t>
+      </w:r>
+    </w:p>
+    <w:p>
+      <w:pPr>
+        <w:spacing w:after="160"/>
+      </w:pPr>
+      <w:proofErr w:type="spellStart"/>
+      <w:r>
+        <w:t>sqlcmd</w:t>
+      </w:r>
+      <w:proofErr w:type="spellEnd"/>
+      <w:r>
+        <w:t xml:space="preserve"> -S HOST_BARU -E -Q "USE master; CREATE MASTER KEY ENCRYPTION BY PASSWORD = 'PasswordDMK_ServerBaru_2026!';"</w:t>
+      </w:r>
+    </w:p>
+    <w:p>
+      <w:pPr>
+        <w:spacing w:after="160"/>
+      </w:pPr>
+      <w:proofErr w:type="spellStart"/>
+      <w:r>
+        <w:t>sqlcmd</w:t>
+      </w:r>
+      <w:proofErr w:type="spellEnd"/>
+      <w:r>
+        <w:t xml:space="preserve"> -S HOST_BARU -E -Q "USE master; CREATE CERTIFICATE TDE_StackOverflow2013_Cert FROM FILE = 'E:\MSSQL\TDE_StackOverflow2013_Cert.cer' WITH PRIVATE KEY (FILE = 'E:\MSSQL\TDE_StackOverflow2013_Cert.pvk', DECRYPTION BY PASSWORD = 'GantiPasswordPrivateKey_2026!');"</w:t>
+      </w:r>
+    </w:p>
+    <w:p>
+      <w:pPr>
+        <w:spacing w:after="160"/>
+      </w:pPr>
+      <w:r>
+        <w:t xml:space="preserve">Baru </w:t>
+      </w:r>
+      <w:proofErr w:type="spellStart"/>
+      <w:r>
+        <w:t>kemudian</w:t>
+      </w:r>
+      <w:proofErr w:type="spellEnd"/>
+      <w:r>
+        <w:t> CREATE DATABASE … FOR ATTACH </w:t>
+      </w:r>
+      <w:proofErr w:type="spellStart"/>
+      <w:r>
+        <w:t>seperti</w:t>
+      </w:r>
+      <w:proofErr w:type="spellEnd"/>
+      <w:r>
+        <w:t xml:space="preserve"> </w:t>
+      </w:r>
+      <w:proofErr w:type="spellStart"/>
+      <w:r>
+        <w:t>sebelumnya</w:t>
+      </w:r>
+      <w:proofErr w:type="spellEnd"/>
+      <w:r>
+        <w:t xml:space="preserve">. Kalau attach </w:t>
+      </w:r>
+      <w:proofErr w:type="spellStart"/>
+      <w:r>
+        <w:t>berhasil</w:t>
+      </w:r>
+      <w:proofErr w:type="spellEnd"/>
+      <w:r>
+        <w:t> </w:t>
+      </w:r>
+      <w:proofErr w:type="spellStart"/>
+      <w:r>
+        <w:rPr>
+          <w:b/>
+          <w:bCs/>
+        </w:rPr>
+        <w:t>hanya</w:t>
+      </w:r>
+      <w:proofErr w:type="spellEnd"/>
+      <w:r>
+        <w:rPr>
+          <w:b/>
+          <w:bCs/>
+        </w:rPr>
+        <w:t xml:space="preserve"> </w:t>
+      </w:r>
+      <w:proofErr w:type="spellStart"/>
+      <w:r>
+        <w:rPr>
+          <w:b/>
+          <w:bCs/>
+        </w:rPr>
+        <w:t>setelah</w:t>
+      </w:r>
+      <w:proofErr w:type="spellEnd"/>
+      <w:r>
+        <w:t> </w:t>
+      </w:r>
+      <w:proofErr w:type="spellStart"/>
+      <w:r>
+        <w:t>sertifikat</w:t>
+      </w:r>
+      <w:proofErr w:type="spellEnd"/>
+      <w:r>
+        <w:t xml:space="preserve"> </w:t>
+      </w:r>
+      <w:proofErr w:type="spellStart"/>
+      <w:r>
+        <w:t>diimport</w:t>
+      </w:r>
+      <w:proofErr w:type="spellEnd"/>
+      <w:r>
+        <w:t xml:space="preserve">, TDE </w:t>
+      </w:r>
+      <w:proofErr w:type="spellStart"/>
+      <w:r>
+        <w:t>terbukti</w:t>
+      </w:r>
+      <w:proofErr w:type="spellEnd"/>
+      <w:r>
+        <w:t xml:space="preserve"> </w:t>
+      </w:r>
+      <w:proofErr w:type="spellStart"/>
+      <w:r>
+        <w:t>bekerja</w:t>
+      </w:r>
+      <w:proofErr w:type="spellEnd"/>
+      <w:r>
+        <w:t>.</w:t>
+      </w:r>
+    </w:p>
+    <w:p>
+      <w:pPr>
+        <w:spacing w:after="160"/>
+      </w:pPr>
+      <w:r>
+        <w:t>.</w:t>
       </w:r>
     </w:p>
     <w:sectPr>
@@ -9447,6 +13571,24 @@
   </w:num>
   <w:num w:numId="9" w16cid:durableId="694311615">
     <w:abstractNumId w:val="0"/>
+  </w:num>
+  <w:num w:numId="10" w16cid:durableId="2030253578">
+    <w:abstractNumId w:val="7"/>
+    <w:lvlOverride w:ilvl="0">
+      <w:startOverride w:val="1"/>
+    </w:lvlOverride>
+  </w:num>
+  <w:num w:numId="11" w16cid:durableId="752975339">
+    <w:abstractNumId w:val="7"/>
+    <w:lvlOverride w:ilvl="0">
+      <w:startOverride w:val="1"/>
+    </w:lvlOverride>
+  </w:num>
+  <w:num w:numId="12" w16cid:durableId="1668896572">
+    <w:abstractNumId w:val="7"/>
+    <w:lvlOverride w:ilvl="0">
+      <w:startOverride w:val="1"/>
+    </w:lvlOverride>
   </w:num>
 </w:numbering>
 </file>
@@ -10058,7 +14200,6 @@
   <w:style w:type="character" w:default="1" w:styleId="DefaultParagraphFont">
     <w:name w:val="Default Paragraph Font"/>
     <w:uiPriority w:val="1"/>
-    <w:semiHidden/>
     <w:unhideWhenUsed/>
   </w:style>
   <w:style w:type="table" w:default="1" w:styleId="TableNormal">

</xml_diff>